<commit_message>
Redesign cover with dense dark layout, add sitting-posture illustrations
Cover now matches the reference's visual density (dark navy, full-bleed,
level badges with mini soroban icons) using only our own brand colors and
content. Added a vector-illustrated correct-vs-incorrect sitting posture
page (book/drawings.py: make_posture_drawing) for both PDF and DOCX, and a
subtle background accent on every page plus bigger cards/tip footer on the
usage-steps page to fix the pale, empty feel.

Co-Authored-By: Claude Sonnet 4.6 <noreply@anthropic.com>
Claude-Session: https://claude.ai/code/session_016P8ZTRKwZv5h1DnuGocGWb
</commit_message>
<xml_diff>
--- a/output/soroban_book.docx
+++ b/output/soroban_book.docx
@@ -2,96 +2,6 @@
 <file path=word/document.xml><?xml version="1.0" encoding="utf-8"?>
 <w:document xmlns:wpc="http://schemas.microsoft.com/office/word/2010/wordprocessingCanvas" xmlns:mo="http://schemas.microsoft.com/office/mac/office/2008/main" xmlns:mc="http://schemas.openxmlformats.org/markup-compatibility/2006" xmlns:mv="urn:schemas-microsoft-com:mac:vml" xmlns:o="urn:schemas-microsoft-com:office:office" xmlns:r="http://schemas.openxmlformats.org/officeDocument/2006/relationships" xmlns:m="http://schemas.openxmlformats.org/officeDocument/2006/math" xmlns:v="urn:schemas-microsoft-com:vml" xmlns:wp14="http://schemas.microsoft.com/office/word/2010/wordprocessingDrawing" xmlns:wp="http://schemas.openxmlformats.org/drawingml/2006/wordprocessingDrawing" xmlns:w10="urn:schemas-microsoft-com:office:word" xmlns:w="http://schemas.openxmlformats.org/wordprocessingml/2006/main" xmlns:w14="http://schemas.microsoft.com/office/word/2010/wordml" xmlns:wpg="http://schemas.microsoft.com/office/word/2010/wordprocessingGroup" xmlns:wpi="http://schemas.microsoft.com/office/word/2010/wordprocessingInk" xmlns:wne="http://schemas.microsoft.com/office/word/2006/wordml" xmlns:wps="http://schemas.microsoft.com/office/word/2010/wordprocessingShape" mc:Ignorable="w14 wp14">
   <w:body>
-    <w:p>
-      <w:pPr>
-        <w:spacing w:after="200" w:before="400"/>
-        <w:jc w:val="center"/>
-        <w:bidi/>
-      </w:pPr>
-      <w:r>
-        <w:rPr>
-          <w:rFonts w:ascii="Cairo" w:hAnsi="Cairo" w:cs="Cairo" w:eastAsia="Cairo"/>
-          <w:b/>
-          <w:color w:val="1A1A2E"/>
-          <w:sz w:val="52"/>
-          <w:rtl/>
-        </w:rPr>
-        <w:t>الحساب الذهني باستخدام السوروبان</w:t>
-      </w:r>
-    </w:p>
-    <w:p>
-      <w:pPr>
-        <w:spacing w:after="120" w:before="0"/>
-        <w:jc w:val="center"/>
-        <w:bidi/>
-      </w:pPr>
-      <w:r>
-        <w:rPr>
-          <w:rFonts w:ascii="Cairo" w:hAnsi="Cairo" w:cs="Cairo" w:eastAsia="Cairo"/>
-          <w:b/>
-          <w:color w:val="2C9B8A"/>
-          <w:sz w:val="28"/>
-          <w:rtl/>
-        </w:rPr>
-        <w:t>دليل ممتع لتعلم الحساب الذهني للأطفال من 6 إلى 10 سنوات</w:t>
-      </w:r>
-    </w:p>
-    <w:p>
-      <w:pPr>
-        <w:spacing w:after="320" w:before="0"/>
-        <w:jc w:val="center"/>
-        <w:bidi/>
-      </w:pPr>
-      <w:r>
-        <w:rPr>
-          <w:rFonts w:ascii="Cairo" w:hAnsi="Cairo" w:cs="Cairo" w:eastAsia="Cairo"/>
-          <w:b w:val="0"/>
-          <w:color w:val="5B5B6B"/>
-          <w:sz w:val="24"/>
-          <w:rtl/>
-        </w:rPr>
-        <w:t>تأليف: اسم المؤلف</w:t>
-      </w:r>
-    </w:p>
-    <w:p>
-      <w:pPr>
-        <w:jc w:val="center"/>
-      </w:pPr>
-      <w:r>
-        <w:drawing>
-          <wp:inline xmlns:a="http://schemas.openxmlformats.org/drawingml/2006/main" xmlns:pic="http://schemas.openxmlformats.org/drawingml/2006/picture">
-            <wp:extent cx="3960000" cy="2396250"/>
-            <wp:docPr id="1" name="Picture 1"/>
-            <wp:cNvGraphicFramePr>
-              <a:graphicFrameLocks noChangeAspect="1"/>
-            </wp:cNvGraphicFramePr>
-            <a:graphic>
-              <a:graphicData uri="http://schemas.openxmlformats.org/drawingml/2006/picture">
-                <pic:pic>
-                  <pic:nvPicPr>
-                    <pic:cNvPr id="0" name="soroban.png"/>
-                    <pic:cNvPicPr/>
-                  </pic:nvPicPr>
-                  <pic:blipFill>
-                    <a:blip r:embed="rId9"/>
-                    <a:stretch>
-                      <a:fillRect/>
-                    </a:stretch>
-                  </pic:blipFill>
-                  <pic:spPr>
-                    <a:xfrm>
-                      <a:off x="0" y="0"/>
-                      <a:ext cx="3960000" cy="2396250"/>
-                    </a:xfrm>
-                    <a:prstGeom prst="rect"/>
-                  </pic:spPr>
-                </pic:pic>
-              </a:graphicData>
-            </a:graphic>
-          </wp:inline>
-        </w:drawing>
-      </w:r>
-    </w:p>
     <w:tbl>
       <w:tblPr>
         <w:tblW w:type="auto" w:w="0"/>
@@ -99,18 +9,41 @@
         <w:tblLook w:firstColumn="1" w:firstRow="1" w:lastColumn="0" w:lastRow="0" w:noHBand="0" w:noVBand="1" w:val="04A0"/>
       </w:tblPr>
       <w:tblGrid>
-        <w:gridCol w:w="3289"/>
-        <w:gridCol w:w="3289"/>
-        <w:gridCol w:w="3289"/>
+        <w:gridCol w:w="9866"/>
       </w:tblGrid>
       <w:tr>
         <w:tc>
           <w:tcPr>
-            <w:tcW w:type="dxa" w:w="3289"/>
-            <w:shd w:val="clear" w:fill="F4A623"/>
+            <w:tcW w:type="dxa" w:w="9866"/>
+            <w:shd w:val="clear" w:fill="1A1A2E"/>
+            <w:tcMar>
+              <w:top w:w="300" w:type="dxa"/>
+              <w:bottom w:w="300" w:type="dxa"/>
+              <w:start w:w="300" w:type="dxa"/>
+              <w:end w:w="300" w:type="dxa"/>
+            </w:tcMar>
           </w:tcPr>
+          <w:p/>
           <w:p>
             <w:pPr>
+              <w:spacing w:after="200" w:before="200"/>
+              <w:jc w:val="center"/>
+              <w:bidi/>
+            </w:pPr>
+            <w:r>
+              <w:rPr>
+                <w:rFonts w:ascii="Cairo" w:hAnsi="Cairo" w:cs="Cairo" w:eastAsia="Cairo"/>
+                <w:b/>
+                <w:color w:val="F4A623"/>
+                <w:sz w:val="22"/>
+                <w:rtl/>
+              </w:rPr>
+              <w:t>كتاب تعليمي</w:t>
+            </w:r>
+          </w:p>
+          <w:p>
+            <w:pPr>
+              <w:spacing w:after="160" w:before="0"/>
               <w:jc w:val="center"/>
               <w:bidi/>
             </w:pPr>
@@ -119,20 +52,72 @@
                 <w:rFonts w:ascii="Cairo" w:hAnsi="Cairo" w:cs="Cairo" w:eastAsia="Cairo"/>
                 <w:b/>
                 <w:color w:val="FFFFFF"/>
+                <w:sz w:val="52"/>
+                <w:rtl/>
+              </w:rPr>
+              <w:t>الحساب الذهني باستخدام السوروبان</w:t>
+            </w:r>
+          </w:p>
+          <w:p>
+            <w:pPr>
+              <w:spacing w:after="280" w:before="0"/>
+              <w:jc w:val="center"/>
+              <w:bidi/>
+            </w:pPr>
+            <w:r>
+              <w:rPr>
+                <w:rFonts w:ascii="Cairo" w:hAnsi="Cairo" w:cs="Cairo" w:eastAsia="Cairo"/>
+                <w:b/>
+                <w:color w:val="7FD9C9"/>
                 <w:sz w:val="26"/>
                 <w:rtl/>
               </w:rPr>
-              <w:t>مبتدئ</w:t>
+              <w:t>دليل ممتع لتعلم الحساب الذهني للأطفال من 6 إلى 10 سنوات</w:t>
             </w:r>
           </w:p>
-        </w:tc>
-        <w:tc>
-          <w:tcPr>
-            <w:tcW w:type="dxa" w:w="3289"/>
-            <w:shd w:val="clear" w:fill="E8614A"/>
-          </w:tcPr>
           <w:p>
             <w:pPr>
+              <w:spacing w:after="280"/>
+              <w:jc w:val="center"/>
+            </w:pPr>
+            <w:r>
+              <w:drawing>
+                <wp:inline xmlns:a="http://schemas.openxmlformats.org/drawingml/2006/main" xmlns:pic="http://schemas.openxmlformats.org/drawingml/2006/picture">
+                  <wp:extent cx="3600000" cy="2178409"/>
+                  <wp:docPr id="1" name="Picture 1"/>
+                  <wp:cNvGraphicFramePr>
+                    <a:graphicFrameLocks noChangeAspect="1"/>
+                  </wp:cNvGraphicFramePr>
+                  <a:graphic>
+                    <a:graphicData uri="http://schemas.openxmlformats.org/drawingml/2006/picture">
+                      <pic:pic>
+                        <pic:nvPicPr>
+                          <pic:cNvPr id="0" name="soroban.png"/>
+                          <pic:cNvPicPr/>
+                        </pic:nvPicPr>
+                        <pic:blipFill>
+                          <a:blip r:embed="rId9"/>
+                          <a:stretch>
+                            <a:fillRect/>
+                          </a:stretch>
+                        </pic:blipFill>
+                        <pic:spPr>
+                          <a:xfrm>
+                            <a:off x="0" y="0"/>
+                            <a:ext cx="3600000" cy="2178409"/>
+                          </a:xfrm>
+                          <a:prstGeom prst="rect"/>
+                        </pic:spPr>
+                      </pic:pic>
+                    </a:graphicData>
+                  </a:graphic>
+                </wp:inline>
+              </w:drawing>
+            </w:r>
+          </w:p>
+          <w:p>
+            <w:pPr>
+              <w:spacing w:after="80" w:before="0"/>
               <w:jc w:val="center"/>
               <w:bidi/>
             </w:pPr>
@@ -141,20 +126,15 @@
                 <w:rFonts w:ascii="Cairo" w:hAnsi="Cairo" w:cs="Cairo" w:eastAsia="Cairo"/>
                 <w:b/>
                 <w:color w:val="FFFFFF"/>
-                <w:sz w:val="26"/>
+                <w:sz w:val="23"/>
                 <w:rtl/>
               </w:rPr>
-              <w:t>متوسط</w:t>
+              <w:t>★ تقوية الذاكرة والتركيز</w:t>
             </w:r>
           </w:p>
-        </w:tc>
-        <w:tc>
-          <w:tcPr>
-            <w:tcW w:type="dxa" w:w="3289"/>
-            <w:shd w:val="clear" w:fill="2C9B8A"/>
-          </w:tcPr>
           <w:p>
             <w:pPr>
+              <w:spacing w:after="80" w:before="0"/>
               <w:jc w:val="center"/>
               <w:bidi/>
             </w:pPr>
@@ -163,10 +143,187 @@
                 <w:rFonts w:ascii="Cairo" w:hAnsi="Cairo" w:cs="Cairo" w:eastAsia="Cairo"/>
                 <w:b/>
                 <w:color w:val="FFFFFF"/>
-                <w:sz w:val="26"/>
+                <w:sz w:val="23"/>
                 <w:rtl/>
               </w:rPr>
-              <w:t>متقدم</w:t>
+              <w:t>★ تحسين سرعة الحساب الذهني</w:t>
+            </w:r>
+          </w:p>
+          <w:p>
+            <w:pPr>
+              <w:spacing w:after="80" w:before="0"/>
+              <w:jc w:val="center"/>
+              <w:bidi/>
+            </w:pPr>
+            <w:r>
+              <w:rPr>
+                <w:rFonts w:ascii="Cairo" w:hAnsi="Cairo" w:cs="Cairo" w:eastAsia="Cairo"/>
+                <w:b/>
+                <w:color w:val="FFFFFF"/>
+                <w:sz w:val="23"/>
+                <w:rtl/>
+              </w:rPr>
+              <w:t>★ تنشيط الدماغ بشقّيه الأيمن والأيسر</w:t>
+            </w:r>
+          </w:p>
+          <w:p>
+            <w:pPr>
+              <w:spacing w:after="160"/>
+            </w:pPr>
+          </w:p>
+          <w:tbl>
+            <w:tblPr>
+              <w:tblW w:type="auto" w:w="0"/>
+              <w:jc w:val="center"/>
+              <w:tblLook w:firstColumn="1" w:firstRow="1" w:lastColumn="0" w:lastRow="0" w:noHBand="0" w:noVBand="1" w:val="04A0"/>
+            </w:tblPr>
+            <w:tblGrid>
+              <w:gridCol w:w="3289"/>
+              <w:gridCol w:w="3289"/>
+              <w:gridCol w:w="3289"/>
+            </w:tblGrid>
+            <w:tr>
+              <w:tc>
+                <w:tcPr>
+                  <w:tcW w:type="dxa" w:w="3289"/>
+                  <w:shd w:val="clear" w:fill="F4A623"/>
+                </w:tcPr>
+                <w:p/>
+                <w:p>
+                  <w:pPr>
+                    <w:spacing w:after="0" w:before="0"/>
+                    <w:jc w:val="center"/>
+                    <w:bidi/>
+                  </w:pPr>
+                  <w:r>
+                    <w:rPr>
+                      <w:rFonts w:ascii="Cairo" w:hAnsi="Cairo" w:cs="Cairo" w:eastAsia="Cairo"/>
+                      <w:b/>
+                      <w:color w:val="FFFFFF"/>
+                      <w:sz w:val="20"/>
+                      <w:rtl/>
+                    </w:rPr>
+                    <w:t>المستوى الأول</w:t>
+                  </w:r>
+                </w:p>
+                <w:p>
+                  <w:pPr>
+                    <w:spacing w:after="0" w:before="0"/>
+                    <w:jc w:val="center"/>
+                    <w:bidi/>
+                  </w:pPr>
+                  <w:r>
+                    <w:rPr>
+                      <w:rFonts w:ascii="Cairo" w:hAnsi="Cairo" w:cs="Cairo" w:eastAsia="Cairo"/>
+                      <w:b/>
+                      <w:color w:val="FFFFFF"/>
+                      <w:sz w:val="26"/>
+                      <w:rtl/>
+                    </w:rPr>
+                    <w:t>مبتدئ</w:t>
+                  </w:r>
+                </w:p>
+              </w:tc>
+              <w:tc>
+                <w:tcPr>
+                  <w:tcW w:type="dxa" w:w="3289"/>
+                  <w:shd w:val="clear" w:fill="E8614A"/>
+                </w:tcPr>
+                <w:p/>
+                <w:p>
+                  <w:pPr>
+                    <w:spacing w:after="0" w:before="0"/>
+                    <w:jc w:val="center"/>
+                    <w:bidi/>
+                  </w:pPr>
+                  <w:r>
+                    <w:rPr>
+                      <w:rFonts w:ascii="Cairo" w:hAnsi="Cairo" w:cs="Cairo" w:eastAsia="Cairo"/>
+                      <w:b/>
+                      <w:color w:val="FFFFFF"/>
+                      <w:sz w:val="20"/>
+                      <w:rtl/>
+                    </w:rPr>
+                    <w:t>المستوى الثاني</w:t>
+                  </w:r>
+                </w:p>
+                <w:p>
+                  <w:pPr>
+                    <w:spacing w:after="0" w:before="0"/>
+                    <w:jc w:val="center"/>
+                    <w:bidi/>
+                  </w:pPr>
+                  <w:r>
+                    <w:rPr>
+                      <w:rFonts w:ascii="Cairo" w:hAnsi="Cairo" w:cs="Cairo" w:eastAsia="Cairo"/>
+                      <w:b/>
+                      <w:color w:val="FFFFFF"/>
+                      <w:sz w:val="26"/>
+                      <w:rtl/>
+                    </w:rPr>
+                    <w:t>متوسط</w:t>
+                  </w:r>
+                </w:p>
+              </w:tc>
+              <w:tc>
+                <w:tcPr>
+                  <w:tcW w:type="dxa" w:w="3289"/>
+                  <w:shd w:val="clear" w:fill="2C9B8A"/>
+                </w:tcPr>
+                <w:p/>
+                <w:p>
+                  <w:pPr>
+                    <w:spacing w:after="0" w:before="0"/>
+                    <w:jc w:val="center"/>
+                    <w:bidi/>
+                  </w:pPr>
+                  <w:r>
+                    <w:rPr>
+                      <w:rFonts w:ascii="Cairo" w:hAnsi="Cairo" w:cs="Cairo" w:eastAsia="Cairo"/>
+                      <w:b/>
+                      <w:color w:val="FFFFFF"/>
+                      <w:sz w:val="20"/>
+                      <w:rtl/>
+                    </w:rPr>
+                    <w:t>المستوى الثالث</w:t>
+                  </w:r>
+                </w:p>
+                <w:p>
+                  <w:pPr>
+                    <w:spacing w:after="0" w:before="0"/>
+                    <w:jc w:val="center"/>
+                    <w:bidi/>
+                  </w:pPr>
+                  <w:r>
+                    <w:rPr>
+                      <w:rFonts w:ascii="Cairo" w:hAnsi="Cairo" w:cs="Cairo" w:eastAsia="Cairo"/>
+                      <w:b/>
+                      <w:color w:val="FFFFFF"/>
+                      <w:sz w:val="26"/>
+                      <w:rtl/>
+                    </w:rPr>
+                    <w:t>متقدم</w:t>
+                  </w:r>
+                </w:p>
+              </w:tc>
+            </w:tr>
+          </w:tbl>
+          <w:p/>
+          <w:p>
+            <w:pPr>
+              <w:spacing w:after="80" w:before="280"/>
+              <w:jc w:val="center"/>
+              <w:bidi/>
+            </w:pPr>
+            <w:r>
+              <w:rPr>
+                <w:rFonts w:ascii="Cairo" w:hAnsi="Cairo" w:cs="Cairo" w:eastAsia="Cairo"/>
+                <w:b w:val="0"/>
+                <w:color w:val="B9B9CE"/>
+                <w:sz w:val="22"/>
+                <w:rtl/>
+              </w:rPr>
+              <w:t>تأليف: اسم المؤلف</w:t>
             </w:r>
           </w:p>
         </w:tc>
@@ -376,6 +533,267 @@
     </w:p>
     <w:p>
       <w:pPr>
+        <w:spacing w:after="160" w:before="0"/>
+        <w:jc w:val="right"/>
+        <w:bidi/>
+      </w:pPr>
+      <w:r>
+        <w:rPr>
+          <w:rFonts w:ascii="Cairo" w:hAnsi="Cairo" w:cs="Cairo" w:eastAsia="Cairo"/>
+          <w:b/>
+          <w:color w:val="1A1A2E"/>
+          <w:sz w:val="40"/>
+          <w:rtl/>
+        </w:rPr>
+        <w:t>الجلسة الصحيحة</w:t>
+      </w:r>
+    </w:p>
+    <w:p>
+      <w:pPr>
+        <w:spacing w:after="280" w:before="0"/>
+        <w:jc w:val="right"/>
+        <w:bidi/>
+      </w:pPr>
+      <w:r>
+        <w:rPr>
+          <w:rFonts w:ascii="Cairo" w:hAnsi="Cairo" w:cs="Cairo" w:eastAsia="Cairo"/>
+          <w:b w:val="0"/>
+          <w:color w:val="5B5B6B"/>
+          <w:sz w:val="25"/>
+          <w:rtl/>
+        </w:rPr>
+        <w:t>هل أنت جاهز؟ لنتعلّم الجلسة الصحيحة أولاً!</w:t>
+      </w:r>
+    </w:p>
+    <w:tbl>
+      <w:tblPr>
+        <w:tblW w:type="auto" w:w="0"/>
+        <w:jc w:val="center"/>
+        <w:tblLook w:firstColumn="1" w:firstRow="1" w:lastColumn="0" w:lastRow="0" w:noHBand="0" w:noVBand="1" w:val="04A0"/>
+      </w:tblPr>
+      <w:tblGrid>
+        <w:gridCol w:w="4933"/>
+        <w:gridCol w:w="4933"/>
+      </w:tblGrid>
+      <w:tr>
+        <w:tc>
+          <w:tcPr>
+            <w:tcW w:type="dxa" w:w="4933"/>
+          </w:tcPr>
+          <w:p/>
+          <w:p>
+            <w:pPr>
+              <w:spacing w:after="120" w:before="0"/>
+              <w:jc w:val="center"/>
+              <w:bidi/>
+            </w:pPr>
+            <w:r>
+              <w:rPr>
+                <w:rFonts w:ascii="Cairo" w:hAnsi="Cairo" w:cs="Cairo" w:eastAsia="Cairo"/>
+                <w:b/>
+                <w:color w:val="E8614A"/>
+                <w:sz w:val="26"/>
+                <w:rtl/>
+              </w:rPr>
+              <w:t>جلسة غير صحيحة</w:t>
+            </w:r>
+          </w:p>
+          <w:p>
+            <w:pPr>
+              <w:jc w:val="center"/>
+            </w:pPr>
+            <w:r>
+              <w:drawing>
+                <wp:inline xmlns:a="http://schemas.openxmlformats.org/drawingml/2006/main" xmlns:pic="http://schemas.openxmlformats.org/drawingml/2006/picture">
+                  <wp:extent cx="1800000" cy="1957746"/>
+                  <wp:docPr id="3" name="Picture 3"/>
+                  <wp:cNvGraphicFramePr>
+                    <a:graphicFrameLocks noChangeAspect="1"/>
+                  </wp:cNvGraphicFramePr>
+                  <a:graphic>
+                    <a:graphicData uri="http://schemas.openxmlformats.org/drawingml/2006/picture">
+                      <pic:pic>
+                        <pic:nvPicPr>
+                          <pic:cNvPr id="0" name="posture_bad.png"/>
+                          <pic:cNvPicPr/>
+                        </pic:nvPicPr>
+                        <pic:blipFill>
+                          <a:blip r:embed="rId10"/>
+                          <a:stretch>
+                            <a:fillRect/>
+                          </a:stretch>
+                        </pic:blipFill>
+                        <pic:spPr>
+                          <a:xfrm>
+                            <a:off x="0" y="0"/>
+                            <a:ext cx="1800000" cy="1957746"/>
+                          </a:xfrm>
+                          <a:prstGeom prst="rect"/>
+                        </pic:spPr>
+                      </pic:pic>
+                    </a:graphicData>
+                  </a:graphic>
+                </wp:inline>
+              </w:drawing>
+            </w:r>
+          </w:p>
+          <w:p>
+            <w:pPr>
+              <w:spacing w:after="60" w:before="0"/>
+              <w:jc w:val="center"/>
+              <w:bidi/>
+            </w:pPr>
+            <w:r>
+              <w:rPr>
+                <w:rFonts w:ascii="Cairo" w:hAnsi="Cairo" w:cs="Cairo" w:eastAsia="Cairo"/>
+                <w:b w:val="0"/>
+                <w:color w:val="1A1A2E"/>
+                <w:sz w:val="21"/>
+                <w:rtl/>
+              </w:rPr>
+              <w:t>• انحناء الظهر للأمام</w:t>
+            </w:r>
+          </w:p>
+          <w:p>
+            <w:pPr>
+              <w:spacing w:after="60" w:before="0"/>
+              <w:jc w:val="center"/>
+              <w:bidi/>
+            </w:pPr>
+            <w:r>
+              <w:rPr>
+                <w:rFonts w:ascii="Cairo" w:hAnsi="Cairo" w:cs="Cairo" w:eastAsia="Cairo"/>
+                <w:b w:val="0"/>
+                <w:color w:val="1A1A2E"/>
+                <w:sz w:val="21"/>
+                <w:rtl/>
+              </w:rPr>
+              <w:t>• قرب زائد من الطاولة</w:t>
+            </w:r>
+          </w:p>
+        </w:tc>
+        <w:tc>
+          <w:tcPr>
+            <w:tcW w:type="dxa" w:w="4933"/>
+          </w:tcPr>
+          <w:p/>
+          <w:p>
+            <w:pPr>
+              <w:spacing w:after="120" w:before="0"/>
+              <w:jc w:val="center"/>
+              <w:bidi/>
+            </w:pPr>
+            <w:r>
+              <w:rPr>
+                <w:rFonts w:ascii="Cairo" w:hAnsi="Cairo" w:cs="Cairo" w:eastAsia="Cairo"/>
+                <w:b/>
+                <w:color w:val="2C9B8A"/>
+                <w:sz w:val="26"/>
+                <w:rtl/>
+              </w:rPr>
+              <w:t>الجلسة الصحيحة</w:t>
+            </w:r>
+          </w:p>
+          <w:p>
+            <w:pPr>
+              <w:jc w:val="center"/>
+            </w:pPr>
+            <w:r>
+              <w:drawing>
+                <wp:inline xmlns:a="http://schemas.openxmlformats.org/drawingml/2006/main" xmlns:pic="http://schemas.openxmlformats.org/drawingml/2006/picture">
+                  <wp:extent cx="1800000" cy="1957746"/>
+                  <wp:docPr id="4" name="Picture 4"/>
+                  <wp:cNvGraphicFramePr>
+                    <a:graphicFrameLocks noChangeAspect="1"/>
+                  </wp:cNvGraphicFramePr>
+                  <a:graphic>
+                    <a:graphicData uri="http://schemas.openxmlformats.org/drawingml/2006/picture">
+                      <pic:pic>
+                        <pic:nvPicPr>
+                          <pic:cNvPr id="0" name="posture_ok.png"/>
+                          <pic:cNvPicPr/>
+                        </pic:nvPicPr>
+                        <pic:blipFill>
+                          <a:blip r:embed="rId11"/>
+                          <a:stretch>
+                            <a:fillRect/>
+                          </a:stretch>
+                        </pic:blipFill>
+                        <pic:spPr>
+                          <a:xfrm>
+                            <a:off x="0" y="0"/>
+                            <a:ext cx="1800000" cy="1957746"/>
+                          </a:xfrm>
+                          <a:prstGeom prst="rect"/>
+                        </pic:spPr>
+                      </pic:pic>
+                    </a:graphicData>
+                  </a:graphic>
+                </wp:inline>
+              </w:drawing>
+            </w:r>
+          </w:p>
+          <w:p>
+            <w:pPr>
+              <w:spacing w:after="60" w:before="0"/>
+              <w:jc w:val="center"/>
+              <w:bidi/>
+            </w:pPr>
+            <w:r>
+              <w:rPr>
+                <w:rFonts w:ascii="Cairo" w:hAnsi="Cairo" w:cs="Cairo" w:eastAsia="Cairo"/>
+                <w:b w:val="0"/>
+                <w:color w:val="1A1A2E"/>
+                <w:sz w:val="21"/>
+                <w:rtl/>
+              </w:rPr>
+              <w:t>• ظهر مستقيم</w:t>
+            </w:r>
+          </w:p>
+          <w:p>
+            <w:pPr>
+              <w:spacing w:after="60" w:before="0"/>
+              <w:jc w:val="center"/>
+              <w:bidi/>
+            </w:pPr>
+            <w:r>
+              <w:rPr>
+                <w:rFonts w:ascii="Cairo" w:hAnsi="Cairo" w:cs="Cairo" w:eastAsia="Cairo"/>
+                <w:b w:val="0"/>
+                <w:color w:val="1A1A2E"/>
+                <w:sz w:val="21"/>
+                <w:rtl/>
+              </w:rPr>
+              <w:t>• قدمان على الأرض</w:t>
+            </w:r>
+          </w:p>
+          <w:p>
+            <w:pPr>
+              <w:spacing w:after="60" w:before="0"/>
+              <w:jc w:val="center"/>
+              <w:bidi/>
+            </w:pPr>
+            <w:r>
+              <w:rPr>
+                <w:rFonts w:ascii="Cairo" w:hAnsi="Cairo" w:cs="Cairo" w:eastAsia="Cairo"/>
+                <w:b w:val="0"/>
+                <w:color w:val="1A1A2E"/>
+                <w:sz w:val="21"/>
+                <w:rtl/>
+              </w:rPr>
+              <w:t>• مسافة مناسبة</w:t>
+            </w:r>
+          </w:p>
+        </w:tc>
+      </w:tr>
+    </w:tbl>
+    <w:p>
+      <w:r>
+        <w:br w:type="page"/>
+      </w:r>
+    </w:p>
+    <w:p>
+      <w:pPr>
         <w:spacing w:after="200" w:before="0"/>
         <w:jc w:val="right"/>
         <w:bidi/>
@@ -388,7 +806,7 @@
           <w:sz w:val="40"/>
           <w:rtl/>
         </w:rPr>
-        <w:t>الجلسة الصحيحة وطريقة الاستخدام</w:t>
+        <w:t>طريقة الاستخدام</w:t>
       </w:r>
     </w:p>
     <w:p>
@@ -399,7 +817,7 @@
         <w:drawing>
           <wp:inline xmlns:a="http://schemas.openxmlformats.org/drawingml/2006/main" xmlns:pic="http://schemas.openxmlformats.org/drawingml/2006/picture">
             <wp:extent cx="1620000" cy="1820225"/>
-            <wp:docPr id="3" name="Picture 3"/>
+            <wp:docPr id="5" name="Picture 5"/>
             <wp:cNvGraphicFramePr>
               <a:graphicFrameLocks noChangeAspect="1"/>
             </wp:cNvGraphicFramePr>
@@ -411,7 +829,7 @@
                     <pic:cNvPicPr/>
                   </pic:nvPicPr>
                   <pic:blipFill>
-                    <a:blip r:embed="rId10"/>
+                    <a:blip r:embed="rId12"/>
                     <a:stretch>
                       <a:fillRect/>
                     </a:stretch>
@@ -444,7 +862,7 @@
           <w:sz w:val="25"/>
           <w:rtl/>
         </w:rPr>
-        <w:t>هل أنت جاهز؟ لنتعلّم الجلسة الصحيحة أولاً!</w:t>
+        <w:t>أحسنت! والآن لنتعلّم كيف نستخدم السوروبان</w:t>
       </w:r>
     </w:p>
     <w:p>
@@ -584,6 +1002,23 @@
       </w:r>
     </w:p>
     <w:p>
+      <w:pPr>
+        <w:spacing w:after="160" w:before="200"/>
+        <w:jc w:val="center"/>
+        <w:bidi/>
+      </w:pPr>
+      <w:r>
+        <w:rPr>
+          <w:rFonts w:ascii="Cairo" w:hAnsi="Cairo" w:cs="Cairo" w:eastAsia="Cairo"/>
+          <w:b/>
+          <w:color w:val="F4A623"/>
+          <w:sz w:val="23"/>
+          <w:rtl/>
+        </w:rPr>
+        <w:t>نصيحة: كرّر هذه الخطوات في كل مرة تستخدم السوروبان حتى تصبح عادة لديك!</w:t>
+      </w:r>
+    </w:p>
+    <w:p>
       <w:r>
         <w:br w:type="page"/>
       </w:r>
@@ -613,7 +1048,7 @@
         <w:drawing>
           <wp:inline xmlns:a="http://schemas.openxmlformats.org/drawingml/2006/main" xmlns:pic="http://schemas.openxmlformats.org/drawingml/2006/picture">
             <wp:extent cx="4680000" cy="2810022"/>
-            <wp:docPr id="4" name="Picture 4"/>
+            <wp:docPr id="6" name="Picture 6"/>
             <wp:cNvGraphicFramePr>
               <a:graphicFrameLocks noChangeAspect="1"/>
             </wp:cNvGraphicFramePr>
@@ -625,7 +1060,7 @@
                     <pic:cNvPicPr/>
                   </pic:nvPicPr>
                   <pic:blipFill>
-                    <a:blip r:embed="rId11"/>
+                    <a:blip r:embed="rId13"/>
                     <a:stretch>
                       <a:fillRect/>
                     </a:stretch>

</xml_diff>

<commit_message>
Add student identity fields, numbered legends, and minimize print-ink usage
Cover now includes name/class/school fill-in fields. Every interior page
is black-text-on-white to cut print cost; numbers replace color-coded
legends on the parts table and level headings. Sitting/posture page
rebuilt as three panels (two correct, one incorrect) matching the
reference image's exact advice and cm measurements. Mascot and
pencil-grip step removed. Every interior page gets a "-----* N *-----"
page-number footer (cover stays unnumbered via a distinct first-page
footer), wired into both the PDF and DOCX builders with schema-correct
OOXML section-property ordering. Intro photo replaced with a cropped,
less cluttered derivative of the same licensed source.

Co-Authored-By: Claude Sonnet 4.6 <noreply@anthropic.com>
Claude-Session: https://claude.ai/code/session_016P8ZTRKwZv5h1DnuGocGWb
</commit_message>
<xml_diff>
--- a/output/soroban_book.docx
+++ b/output/soroban_book.docx
@@ -113,7 +113,7 @@
                           <pic:cNvPicPr/>
                         </pic:nvPicPr>
                         <pic:blipFill>
-                          <a:blip r:embed="rId9"/>
+                          <a:blip r:embed="rId11"/>
                           <a:stretch>
                             <a:fillRect/>
                           </a:stretch>
@@ -360,6 +360,143 @@
               <w:t>عضو نقابة المدرّبين العراقيين</w:t>
             </w:r>
           </w:p>
+          <w:p>
+            <w:pPr>
+              <w:spacing w:after="80"/>
+            </w:pPr>
+          </w:p>
+          <w:tbl>
+            <w:tblPr>
+              <w:tblW w:type="auto" w:w="0"/>
+              <w:jc w:val="center"/>
+              <w:tblLook w:firstColumn="1" w:firstRow="1" w:lastColumn="0" w:lastRow="0" w:noHBand="0" w:noVBand="1" w:val="04A0"/>
+            </w:tblPr>
+            <w:tblGrid>
+              <w:gridCol w:w="4933"/>
+              <w:gridCol w:w="4933"/>
+            </w:tblGrid>
+            <w:tr>
+              <w:tc>
+                <w:tcPr>
+                  <w:tcW w:type="dxa" w:w="5953"/>
+                  <w:tcBorders>
+                    <w:bottom w:val="single" w:sz="8" w:color="AEB8C2"/>
+                  </w:tcBorders>
+                </w:tcPr>
+                <w:p/>
+              </w:tc>
+              <w:tc>
+                <w:tcPr>
+                  <w:tcW w:type="dxa" w:w="4933"/>
+                </w:tcPr>
+                <w:p>
+                  <w:pPr>
+                    <w:jc w:val="right"/>
+                    <w:bidi/>
+                  </w:pPr>
+                  <w:r>
+                    <w:rPr>
+                      <w:rFonts w:ascii="Cairo" w:hAnsi="Cairo" w:cs="Cairo" w:eastAsia="Cairo"/>
+                      <w:b/>
+                      <w:color w:val="FFFFFF"/>
+                      <w:sz w:val="23"/>
+                      <w:rtl/>
+                    </w:rPr>
+                    <w:t xml:space="preserve">اسم الطالب/ة:  </w:t>
+                  </w:r>
+                </w:p>
+              </w:tc>
+            </w:tr>
+          </w:tbl>
+          <w:p/>
+          <w:tbl>
+            <w:tblPr>
+              <w:tblW w:type="auto" w:w="0"/>
+              <w:jc w:val="center"/>
+              <w:tblLook w:firstColumn="1" w:firstRow="1" w:lastColumn="0" w:lastRow="0" w:noHBand="0" w:noVBand="1" w:val="04A0"/>
+            </w:tblPr>
+            <w:tblGrid>
+              <w:gridCol w:w="4933"/>
+              <w:gridCol w:w="4933"/>
+            </w:tblGrid>
+            <w:tr>
+              <w:tc>
+                <w:tcPr>
+                  <w:tcW w:type="dxa" w:w="2835"/>
+                  <w:tcBorders>
+                    <w:bottom w:val="single" w:sz="8" w:color="AEB8C2"/>
+                  </w:tcBorders>
+                </w:tcPr>
+                <w:p/>
+              </w:tc>
+              <w:tc>
+                <w:tcPr>
+                  <w:tcW w:type="dxa" w:w="4933"/>
+                </w:tcPr>
+                <w:p>
+                  <w:pPr>
+                    <w:jc w:val="right"/>
+                    <w:bidi/>
+                  </w:pPr>
+                  <w:r>
+                    <w:rPr>
+                      <w:rFonts w:ascii="Cairo" w:hAnsi="Cairo" w:cs="Cairo" w:eastAsia="Cairo"/>
+                      <w:b/>
+                      <w:color w:val="FFFFFF"/>
+                      <w:sz w:val="23"/>
+                      <w:rtl/>
+                    </w:rPr>
+                    <w:t xml:space="preserve">الصف:  </w:t>
+                  </w:r>
+                </w:p>
+              </w:tc>
+            </w:tr>
+          </w:tbl>
+          <w:p/>
+          <w:tbl>
+            <w:tblPr>
+              <w:tblW w:type="auto" w:w="0"/>
+              <w:jc w:val="center"/>
+              <w:tblLook w:firstColumn="1" w:firstRow="1" w:lastColumn="0" w:lastRow="0" w:noHBand="0" w:noVBand="1" w:val="04A0"/>
+            </w:tblPr>
+            <w:tblGrid>
+              <w:gridCol w:w="4933"/>
+              <w:gridCol w:w="4933"/>
+            </w:tblGrid>
+            <w:tr>
+              <w:tc>
+                <w:tcPr>
+                  <w:tcW w:type="dxa" w:w="2835"/>
+                  <w:tcBorders>
+                    <w:bottom w:val="single" w:sz="8" w:color="AEB8C2"/>
+                  </w:tcBorders>
+                </w:tcPr>
+                <w:p/>
+              </w:tc>
+              <w:tc>
+                <w:tcPr>
+                  <w:tcW w:type="dxa" w:w="4933"/>
+                </w:tcPr>
+                <w:p>
+                  <w:pPr>
+                    <w:jc w:val="right"/>
+                    <w:bidi/>
+                  </w:pPr>
+                  <w:r>
+                    <w:rPr>
+                      <w:rFonts w:ascii="Cairo" w:hAnsi="Cairo" w:cs="Cairo" w:eastAsia="Cairo"/>
+                      <w:b/>
+                      <w:color w:val="FFFFFF"/>
+                      <w:sz w:val="23"/>
+                      <w:rtl/>
+                    </w:rPr>
+                    <w:t xml:space="preserve">المدرسة:  </w:t>
+                  </w:r>
+                </w:p>
+              </w:tc>
+            </w:tr>
+          </w:tbl>
+          <w:p/>
         </w:tc>
       </w:tr>
     </w:tbl>
@@ -378,7 +515,7 @@
         <w:rPr>
           <w:rFonts w:ascii="Cairo" w:hAnsi="Cairo" w:cs="Cairo" w:eastAsia="Cairo"/>
           <w:b/>
-          <w:color w:val="1C3D5F"/>
+          <w:color w:val="000000"/>
           <w:sz w:val="40"/>
           <w:rtl/>
         </w:rPr>
@@ -395,11 +532,11 @@
         <w:rPr>
           <w:rFonts w:ascii="Cairo" w:hAnsi="Cairo" w:cs="Cairo" w:eastAsia="Cairo"/>
           <w:b w:val="0"/>
-          <w:color w:val="1C3D5F"/>
+          <w:color w:val="000000"/>
           <w:sz w:val="25"/>
           <w:rtl/>
         </w:rPr>
-        <w:t>السوروبان هو أداة حساب يابانية قديمة تشبه العداد، يُستخدم لتعليم الأطفال الحساب الذهني بطريقة ممتعة وسريعة. يتكون من إطار خشبي وأعواد رأسية عليها خرز يمكن تحريكه للأعلى والأسفل لتمثيل الأرقام. ومع التدريب المستمر، يستطيع الطفل أن يحسب الأرقام في رأسه بسرعة كبيرة، حتى بدون الحاجة إلى السوروبان نفسه أو الآلة الحاسبة!</w:t>
+        <w:t>يُعد السوروبان (Soroban)، المعروف أيضاً باسم الأباكس الياباني/الصيني، أداةً تقليدية للحساب اليدوي استُخدمت لعدة قرون لإجراء العمليات الحسابية بسرعة ودقة. تعود أصول الأباكس إلى الصين، حيث ظهر أولاً باسم السوانبان، ثم انتقل إلى اليابان وتطور ليصبح السوروبان بشكله المعروف اليوم</w:t>
       </w:r>
     </w:p>
     <w:p>
@@ -409,7 +546,7 @@
       <w:r>
         <w:drawing>
           <wp:inline xmlns:a="http://schemas.openxmlformats.org/drawingml/2006/main" xmlns:pic="http://schemas.openxmlformats.org/drawingml/2006/picture">
-            <wp:extent cx="4320000" cy="2868750"/>
+            <wp:extent cx="4320000" cy="2075294"/>
             <wp:docPr id="2" name="Picture 2"/>
             <wp:cNvGraphicFramePr>
               <a:graphicFrameLocks noChangeAspect="1"/>
@@ -418,11 +555,11 @@
               <a:graphicData uri="http://schemas.openxmlformats.org/drawingml/2006/picture">
                 <pic:pic>
                   <pic:nvPicPr>
-                    <pic:cNvPr id="0" name="soroban_desk.jpg"/>
+                    <pic:cNvPr id="0" name="soroban_intro.jpg"/>
                     <pic:cNvPicPr/>
                   </pic:nvPicPr>
                   <pic:blipFill>
-                    <a:blip r:embed="rId10"/>
+                    <a:blip r:embed="rId12"/>
                     <a:stretch>
                       <a:fillRect/>
                     </a:stretch>
@@ -430,7 +567,7 @@
                   <pic:spPr>
                     <a:xfrm>
                       <a:off x="0" y="0"/>
-                      <a:ext cx="4320000" cy="2868750"/>
+                      <a:ext cx="4320000" cy="2075294"/>
                     </a:xfrm>
                     <a:prstGeom prst="rect"/>
                   </pic:spPr>
@@ -451,7 +588,7 @@
         <w:rPr>
           <w:rFonts w:ascii="Cairo" w:hAnsi="Cairo" w:cs="Cairo" w:eastAsia="Cairo"/>
           <w:b w:val="0"/>
-          <w:color w:val="5B5B6B"/>
+          <w:color w:val="000000"/>
           <w:sz w:val="21"/>
           <w:rtl/>
         </w:rPr>
@@ -468,7 +605,7 @@
         <w:rPr>
           <w:rFonts w:ascii="Cairo" w:hAnsi="Cairo" w:cs="Cairo" w:eastAsia="Cairo"/>
           <w:b/>
-          <w:color w:val="C68A3E"/>
+          <w:color w:val="000000"/>
           <w:sz w:val="30"/>
           <w:rtl/>
         </w:rPr>
@@ -485,7 +622,7 @@
         <w:rPr>
           <w:rFonts w:ascii="Cairo" w:hAnsi="Cairo" w:cs="Cairo" w:eastAsia="Cairo"/>
           <w:b w:val="0"/>
-          <w:color w:val="1C3D5F"/>
+          <w:color w:val="000000"/>
           <w:sz w:val="24"/>
           <w:rtl/>
         </w:rPr>
@@ -502,7 +639,7 @@
         <w:rPr>
           <w:rFonts w:ascii="Cairo" w:hAnsi="Cairo" w:cs="Cairo" w:eastAsia="Cairo"/>
           <w:b w:val="0"/>
-          <w:color w:val="1C3D5F"/>
+          <w:color w:val="000000"/>
           <w:sz w:val="24"/>
           <w:rtl/>
         </w:rPr>
@@ -519,7 +656,7 @@
         <w:rPr>
           <w:rFonts w:ascii="Cairo" w:hAnsi="Cairo" w:cs="Cairo" w:eastAsia="Cairo"/>
           <w:b w:val="0"/>
-          <w:color w:val="1C3D5F"/>
+          <w:color w:val="000000"/>
           <w:sz w:val="24"/>
           <w:rtl/>
         </w:rPr>
@@ -536,7 +673,7 @@
         <w:rPr>
           <w:rFonts w:ascii="Cairo" w:hAnsi="Cairo" w:cs="Cairo" w:eastAsia="Cairo"/>
           <w:b w:val="0"/>
-          <w:color w:val="1C3D5F"/>
+          <w:color w:val="000000"/>
           <w:sz w:val="24"/>
           <w:rtl/>
         </w:rPr>
@@ -553,7 +690,7 @@
         <w:rPr>
           <w:rFonts w:ascii="Cairo" w:hAnsi="Cairo" w:cs="Cairo" w:eastAsia="Cairo"/>
           <w:b w:val="0"/>
-          <w:color w:val="1C3D5F"/>
+          <w:color w:val="000000"/>
           <w:sz w:val="24"/>
           <w:rtl/>
         </w:rPr>
@@ -575,24 +712,24 @@
         <w:rPr>
           <w:rFonts w:ascii="Cairo" w:hAnsi="Cairo" w:cs="Cairo" w:eastAsia="Cairo"/>
           <w:b/>
-          <w:color w:val="1C3D5F"/>
+          <w:color w:val="000000"/>
           <w:sz w:val="40"/>
           <w:rtl/>
         </w:rPr>
-        <w:t>الجلسة الصحيحة</w:t>
+        <w:t>طرق الجلوس المناسبة</w:t>
       </w:r>
     </w:p>
     <w:p>
       <w:pPr>
         <w:spacing w:after="280" w:before="0"/>
-        <w:jc w:val="right"/>
+        <w:jc w:val="center"/>
         <w:bidi/>
       </w:pPr>
       <w:r>
         <w:rPr>
           <w:rFonts w:ascii="Cairo" w:hAnsi="Cairo" w:cs="Cairo" w:eastAsia="Cairo"/>
           <w:b w:val="0"/>
-          <w:color w:val="5B5B6B"/>
+          <w:color w:val="000000"/>
           <w:sz w:val="25"/>
           <w:rtl/>
         </w:rPr>
@@ -625,11 +762,11 @@
               <w:rPr>
                 <w:rFonts w:ascii="Cairo" w:hAnsi="Cairo" w:cs="Cairo" w:eastAsia="Cairo"/>
                 <w:b/>
-                <w:color w:val="D8593F"/>
+                <w:color w:val="2E8B7F"/>
                 <w:sz w:val="26"/>
                 <w:rtl/>
               </w:rPr>
-              <w:t>جلسة غير صحيحة</w:t>
+              <w:t>شكل رقم (2)</w:t>
             </w:r>
           </w:p>
           <w:p>
@@ -639,8 +776,8 @@
             <w:r>
               <w:drawing>
                 <wp:inline xmlns:a="http://schemas.openxmlformats.org/drawingml/2006/main" xmlns:pic="http://schemas.openxmlformats.org/drawingml/2006/picture">
-                  <wp:extent cx="1800000" cy="1875562"/>
-                  <wp:docPr id="3" name="Picture 3"/>
+                  <wp:extent cx="1980000" cy="2226387"/>
+                  <wp:docPr id="4" name="Picture 4"/>
                   <wp:cNvGraphicFramePr>
                     <a:graphicFrameLocks noChangeAspect="1"/>
                   </wp:cNvGraphicFramePr>
@@ -648,11 +785,11 @@
                     <a:graphicData uri="http://schemas.openxmlformats.org/drawingml/2006/picture">
                       <pic:pic>
                         <pic:nvPicPr>
-                          <pic:cNvPr id="0" name="posture_bad.png"/>
+                          <pic:cNvPr id="0" name="posture_correct2.png"/>
                           <pic:cNvPicPr/>
                         </pic:nvPicPr>
                         <pic:blipFill>
-                          <a:blip r:embed="rId11"/>
+                          <a:blip r:embed="rId14"/>
                           <a:stretch>
                             <a:fillRect/>
                           </a:stretch>
@@ -660,7 +797,7 @@
                         <pic:spPr>
                           <a:xfrm>
                             <a:off x="0" y="0"/>
-                            <a:ext cx="1800000" cy="1875562"/>
+                            <a:ext cx="1980000" cy="2226387"/>
                           </a:xfrm>
                           <a:prstGeom prst="rect"/>
                         </pic:spPr>
@@ -681,11 +818,11 @@
               <w:rPr>
                 <w:rFonts w:ascii="Cairo" w:hAnsi="Cairo" w:cs="Cairo" w:eastAsia="Cairo"/>
                 <w:b w:val="0"/>
-                <w:color w:val="1C3D5F"/>
-                <w:sz w:val="21"/>
+                <w:color w:val="000000"/>
+                <w:sz w:val="20"/>
                 <w:rtl/>
               </w:rPr>
-              <w:t>• انحناء الظهر للأمام</w:t>
+              <w:t>• اجلس مستقيماً والظهر ملامس لمسند الكرسي</w:t>
             </w:r>
           </w:p>
           <w:p>
@@ -698,11 +835,28 @@
               <w:rPr>
                 <w:rFonts w:ascii="Cairo" w:hAnsi="Cairo" w:cs="Cairo" w:eastAsia="Cairo"/>
                 <w:b w:val="0"/>
-                <w:color w:val="1C3D5F"/>
-                <w:sz w:val="21"/>
+                <w:color w:val="000000"/>
+                <w:sz w:val="20"/>
                 <w:rtl/>
               </w:rPr>
-              <w:t>• قرب زائد من الطاولة</w:t>
+              <w:t>• الكتفان مسترخيان ولا تميل بجسمك للأمام أو للخلف</w:t>
+            </w:r>
+          </w:p>
+          <w:p>
+            <w:pPr>
+              <w:spacing w:after="60" w:before="0"/>
+              <w:jc w:val="center"/>
+              <w:bidi/>
+            </w:pPr>
+            <w:r>
+              <w:rPr>
+                <w:rFonts w:ascii="Cairo" w:hAnsi="Cairo" w:cs="Cairo" w:eastAsia="Cairo"/>
+                <w:b w:val="0"/>
+                <w:color w:val="000000"/>
+                <w:sz w:val="20"/>
+                <w:rtl/>
+              </w:rPr>
+              <w:t>• القدمان مسطحتان على الأرض</w:t>
             </w:r>
           </w:p>
         </w:tc>
@@ -725,7 +879,7 @@
                 <w:sz w:val="26"/>
                 <w:rtl/>
               </w:rPr>
-              <w:t>الجلسة الصحيحة</w:t>
+              <w:t>شكل رقم (1)</w:t>
             </w:r>
           </w:p>
           <w:p>
@@ -735,8 +889,8 @@
             <w:r>
               <w:drawing>
                 <wp:inline xmlns:a="http://schemas.openxmlformats.org/drawingml/2006/main" xmlns:pic="http://schemas.openxmlformats.org/drawingml/2006/picture">
-                  <wp:extent cx="1800000" cy="1875562"/>
-                  <wp:docPr id="4" name="Picture 4"/>
+                  <wp:extent cx="1980000" cy="2226387"/>
+                  <wp:docPr id="3" name="Picture 3"/>
                   <wp:cNvGraphicFramePr>
                     <a:graphicFrameLocks noChangeAspect="1"/>
                   </wp:cNvGraphicFramePr>
@@ -744,11 +898,11 @@
                     <a:graphicData uri="http://schemas.openxmlformats.org/drawingml/2006/picture">
                       <pic:pic>
                         <pic:nvPicPr>
-                          <pic:cNvPr id="0" name="posture_ok.png"/>
+                          <pic:cNvPr id="0" name="posture_correct1.png"/>
                           <pic:cNvPicPr/>
                         </pic:nvPicPr>
                         <pic:blipFill>
-                          <a:blip r:embed="rId12"/>
+                          <a:blip r:embed="rId13"/>
                           <a:stretch>
                             <a:fillRect/>
                           </a:stretch>
@@ -756,7 +910,7 @@
                         <pic:spPr>
                           <a:xfrm>
                             <a:off x="0" y="0"/>
-                            <a:ext cx="1800000" cy="1875562"/>
+                            <a:ext cx="1980000" cy="2226387"/>
                           </a:xfrm>
                           <a:prstGeom prst="rect"/>
                         </pic:spPr>
@@ -777,11 +931,11 @@
               <w:rPr>
                 <w:rFonts w:ascii="Cairo" w:hAnsi="Cairo" w:cs="Cairo" w:eastAsia="Cairo"/>
                 <w:b w:val="0"/>
-                <w:color w:val="1C3D5F"/>
-                <w:sz w:val="21"/>
+                <w:color w:val="000000"/>
+                <w:sz w:val="20"/>
                 <w:rtl/>
               </w:rPr>
-              <w:t>• ظهر مستقيم</w:t>
+              <w:t>• اجلس مستقيماً مع الحفاظ على استقامة الظهر</w:t>
             </w:r>
           </w:p>
           <w:p>
@@ -794,11 +948,11 @@
               <w:rPr>
                 <w:rFonts w:ascii="Cairo" w:hAnsi="Cairo" w:cs="Cairo" w:eastAsia="Cairo"/>
                 <w:b w:val="0"/>
-                <w:color w:val="1C3D5F"/>
-                <w:sz w:val="21"/>
+                <w:color w:val="000000"/>
+                <w:sz w:val="20"/>
                 <w:rtl/>
               </w:rPr>
-              <w:t>• قدمان على الأرض</w:t>
+              <w:t>• اجعل المسافة بين عينيك والورقة مناسبة (حوالي 25-45 سم)</w:t>
             </w:r>
           </w:p>
           <w:p>
@@ -811,36 +965,49 @@
               <w:rPr>
                 <w:rFonts w:ascii="Cairo" w:hAnsi="Cairo" w:cs="Cairo" w:eastAsia="Cairo"/>
                 <w:b w:val="0"/>
-                <w:color w:val="1C3D5F"/>
-                <w:sz w:val="21"/>
+                <w:color w:val="000000"/>
+                <w:sz w:val="20"/>
                 <w:rtl/>
               </w:rPr>
-              <w:t>• مسافة مناسبة</w:t>
+              <w:t>• ضع المرفقين على سطح الطاولة</w:t>
+            </w:r>
+          </w:p>
+          <w:p>
+            <w:pPr>
+              <w:spacing w:after="60" w:before="0"/>
+              <w:jc w:val="center"/>
+              <w:bidi/>
+            </w:pPr>
+            <w:r>
+              <w:rPr>
+                <w:rFonts w:ascii="Cairo" w:hAnsi="Cairo" w:cs="Cairo" w:eastAsia="Cairo"/>
+                <w:b w:val="0"/>
+                <w:color w:val="000000"/>
+                <w:sz w:val="20"/>
+                <w:rtl/>
+              </w:rPr>
+              <w:t>• القدمان مسطحتان على الأرض</w:t>
             </w:r>
           </w:p>
         </w:tc>
       </w:tr>
     </w:tbl>
-    <w:p>
-      <w:r>
-        <w:br w:type="page"/>
-      </w:r>
-    </w:p>
+    <w:p/>
     <w:p>
       <w:pPr>
-        <w:spacing w:after="200" w:before="0"/>
-        <w:jc w:val="right"/>
+        <w:spacing w:after="120" w:before="0"/>
+        <w:jc w:val="center"/>
         <w:bidi/>
       </w:pPr>
       <w:r>
         <w:rPr>
           <w:rFonts w:ascii="Cairo" w:hAnsi="Cairo" w:cs="Cairo" w:eastAsia="Cairo"/>
           <w:b/>
-          <w:color w:val="C68A3E"/>
-          <w:sz w:val="40"/>
+          <w:color w:val="D8593F"/>
+          <w:sz w:val="27"/>
           <w:rtl/>
         </w:rPr>
-        <w:t>طريقة الاستخدام</w:t>
+        <w:t>طريقة جلوس غير مناسبة</w:t>
       </w:r>
     </w:p>
     <w:p>
@@ -850,7 +1017,7 @@
       <w:r>
         <w:drawing>
           <wp:inline xmlns:a="http://schemas.openxmlformats.org/drawingml/2006/main" xmlns:pic="http://schemas.openxmlformats.org/drawingml/2006/picture">
-            <wp:extent cx="1620000" cy="1820225"/>
+            <wp:extent cx="2340000" cy="2631184"/>
             <wp:docPr id="5" name="Picture 5"/>
             <wp:cNvGraphicFramePr>
               <a:graphicFrameLocks noChangeAspect="1"/>
@@ -859,11 +1026,11 @@
               <a:graphicData uri="http://schemas.openxmlformats.org/drawingml/2006/picture">
                 <pic:pic>
                   <pic:nvPicPr>
-                    <pic:cNvPr id="0" name="mascot.png"/>
+                    <pic:cNvPr id="0" name="posture_incorrect.png"/>
                     <pic:cNvPicPr/>
                   </pic:nvPicPr>
                   <pic:blipFill>
-                    <a:blip r:embed="rId13"/>
+                    <a:blip r:embed="rId15"/>
                     <a:stretch>
                       <a:fillRect/>
                     </a:stretch>
@@ -871,7 +1038,7 @@
                   <pic:spPr>
                     <a:xfrm>
                       <a:off x="0" y="0"/>
-                      <a:ext cx="1620000" cy="1820225"/>
+                      <a:ext cx="2340000" cy="2631184"/>
                     </a:xfrm>
                     <a:prstGeom prst="rect"/>
                   </pic:spPr>
@@ -884,19 +1051,75 @@
     </w:p>
     <w:p>
       <w:pPr>
-        <w:spacing w:after="320" w:before="0"/>
+        <w:spacing w:after="80" w:before="0"/>
         <w:jc w:val="center"/>
         <w:bidi/>
       </w:pPr>
       <w:r>
         <w:rPr>
           <w:rFonts w:ascii="Cairo" w:hAnsi="Cairo" w:cs="Cairo" w:eastAsia="Cairo"/>
-          <w:b/>
-          <w:color w:val="1C3D5F"/>
-          <w:sz w:val="25"/>
+          <w:b w:val="0"/>
+          <w:color w:val="000000"/>
+          <w:sz w:val="22"/>
           <w:rtl/>
         </w:rPr>
-        <w:t>أحسنت! والآن لنتعلّم كيف نستخدم السوروبان</w:t>
+        <w:t>• الانحناء الشديد للأمام يسبب آلام الظهر والرقبة</w:t>
+      </w:r>
+    </w:p>
+    <w:p>
+      <w:pPr>
+        <w:spacing w:after="80" w:before="0"/>
+        <w:jc w:val="center"/>
+        <w:bidi/>
+      </w:pPr>
+      <w:r>
+        <w:rPr>
+          <w:rFonts w:ascii="Cairo" w:hAnsi="Cairo" w:cs="Cairo" w:eastAsia="Cairo"/>
+          <w:b w:val="0"/>
+          <w:color w:val="000000"/>
+          <w:sz w:val="22"/>
+          <w:rtl/>
+        </w:rPr>
+        <w:t>• المسافة القريبة جداً بين العينين والورقة (8-10 سم) تسبب إجهاد العين</w:t>
+      </w:r>
+    </w:p>
+    <w:p>
+      <w:pPr>
+        <w:spacing w:after="80" w:before="0"/>
+        <w:jc w:val="center"/>
+        <w:bidi/>
+      </w:pPr>
+      <w:r>
+        <w:rPr>
+          <w:rFonts w:ascii="Cairo" w:hAnsi="Cairo" w:cs="Cairo" w:eastAsia="Cairo"/>
+          <w:b w:val="0"/>
+          <w:color w:val="000000"/>
+          <w:sz w:val="22"/>
+          <w:rtl/>
+        </w:rPr>
+        <w:t>• تقويس الظهر ووضعية الجلوس الخاطئة تؤثر على الصحة والتركيز</w:t>
+      </w:r>
+    </w:p>
+    <w:p>
+      <w:r>
+        <w:br w:type="page"/>
+      </w:r>
+    </w:p>
+    <w:p>
+      <w:pPr>
+        <w:spacing w:after="280" w:before="0"/>
+        <w:jc w:val="right"/>
+        <w:bidi/>
+      </w:pPr>
+      <w:r>
+        <w:rPr>
+          <w:rFonts w:ascii="Cairo" w:hAnsi="Cairo" w:cs="Cairo" w:eastAsia="Cairo"/>
+          <w:b/>
+          <w:color w:val="000000"/>
+          <w:sz w:val="40"/>
+          <w:rtl/>
+        </w:rPr>
+        <w:t>طريقة الاستخدام</w:t>
       </w:r>
     </w:p>
     <w:p>
@@ -909,7 +1132,7 @@
         <w:rPr>
           <w:rFonts w:ascii="Cairo" w:hAnsi="Cairo" w:cs="Cairo" w:eastAsia="Cairo"/>
           <w:b/>
-          <w:color w:val="1C3D5F"/>
+          <w:color w:val="000000"/>
           <w:sz w:val="27"/>
           <w:rtl/>
         </w:rPr>
@@ -926,7 +1149,7 @@
         <w:rPr>
           <w:rFonts w:ascii="Cairo" w:hAnsi="Cairo" w:cs="Cairo" w:eastAsia="Cairo"/>
           <w:b w:val="0"/>
-          <w:color w:val="5B5B6B"/>
+          <w:color w:val="000000"/>
           <w:sz w:val="23"/>
           <w:rtl/>
         </w:rPr>
@@ -943,11 +1166,11 @@
         <w:rPr>
           <w:rFonts w:ascii="Cairo" w:hAnsi="Cairo" w:cs="Cairo" w:eastAsia="Cairo"/>
           <w:b/>
-          <w:color w:val="1C3D5F"/>
+          <w:color w:val="000000"/>
           <w:sz w:val="27"/>
           <w:rtl/>
         </w:rPr>
-        <w:t>2. طريقة حمل القلم</w:t>
+        <w:t>2. ضع يديك بشكل صحيح</w:t>
       </w:r>
     </w:p>
     <w:p>
@@ -960,41 +1183,7 @@
         <w:rPr>
           <w:rFonts w:ascii="Cairo" w:hAnsi="Cairo" w:cs="Cairo" w:eastAsia="Cairo"/>
           <w:b w:val="0"/>
-          <w:color w:val="5B5B6B"/>
-          <w:sz w:val="23"/>
-          <w:rtl/>
-        </w:rPr>
-        <w:t>احمل القلم بثلاث أصابع بشكل مريح وغير مشدود</w:t>
-      </w:r>
-    </w:p>
-    <w:p>
-      <w:pPr>
-        <w:spacing w:after="40" w:before="0"/>
-        <w:jc w:val="right"/>
-        <w:bidi/>
-      </w:pPr>
-      <w:r>
-        <w:rPr>
-          <w:rFonts w:ascii="Cairo" w:hAnsi="Cairo" w:cs="Cairo" w:eastAsia="Cairo"/>
-          <w:b/>
-          <w:color w:val="1C3D5F"/>
-          <w:sz w:val="27"/>
-          <w:rtl/>
-        </w:rPr>
-        <w:t>3. ضع يديك بشكل صحيح</w:t>
-      </w:r>
-    </w:p>
-    <w:p>
-      <w:pPr>
-        <w:spacing w:after="240" w:before="0"/>
-        <w:jc w:val="right"/>
-        <w:bidi/>
-      </w:pPr>
-      <w:r>
-        <w:rPr>
-          <w:rFonts w:ascii="Cairo" w:hAnsi="Cairo" w:cs="Cairo" w:eastAsia="Cairo"/>
-          <w:b w:val="0"/>
-          <w:color w:val="5B5B6B"/>
+          <w:color w:val="000000"/>
           <w:sz w:val="23"/>
           <w:rtl/>
         </w:rPr>
@@ -1011,11 +1200,11 @@
         <w:rPr>
           <w:rFonts w:ascii="Cairo" w:hAnsi="Cairo" w:cs="Cairo" w:eastAsia="Cairo"/>
           <w:b/>
-          <w:color w:val="1C3D5F"/>
+          <w:color w:val="000000"/>
           <w:sz w:val="27"/>
           <w:rtl/>
         </w:rPr>
-        <w:t>4. ركّز عينيك</w:t>
+        <w:t>3. ركّز عينيك</w:t>
       </w:r>
     </w:p>
     <w:p>
@@ -1028,7 +1217,7 @@
         <w:rPr>
           <w:rFonts w:ascii="Cairo" w:hAnsi="Cairo" w:cs="Cairo" w:eastAsia="Cairo"/>
           <w:b w:val="0"/>
-          <w:color w:val="5B5B6B"/>
+          <w:color w:val="000000"/>
           <w:sz w:val="23"/>
           <w:rtl/>
         </w:rPr>
@@ -1045,7 +1234,7 @@
         <w:rPr>
           <w:rFonts w:ascii="Cairo" w:hAnsi="Cairo" w:cs="Cairo" w:eastAsia="Cairo"/>
           <w:b/>
-          <w:color w:val="C68A3E"/>
+          <w:color w:val="000000"/>
           <w:sz w:val="23"/>
           <w:rtl/>
         </w:rPr>
@@ -1067,7 +1256,7 @@
         <w:rPr>
           <w:rFonts w:ascii="Cairo" w:hAnsi="Cairo" w:cs="Cairo" w:eastAsia="Cairo"/>
           <w:b/>
-          <w:color w:val="C68A3E"/>
+          <w:color w:val="000000"/>
           <w:sz w:val="40"/>
           <w:rtl/>
         </w:rPr>
@@ -1094,7 +1283,7 @@
                     <pic:cNvPicPr/>
                   </pic:nvPicPr>
                   <pic:blipFill>
-                    <a:blip r:embed="rId14"/>
+                    <a:blip r:embed="rId16"/>
                     <a:stretch>
                       <a:fillRect/>
                     </a:stretch>
@@ -1121,14 +1310,14 @@
         <w:tblLook w:firstColumn="1" w:firstRow="1" w:lastColumn="0" w:lastRow="0" w:noHBand="0" w:noVBand="1" w:val="04A0"/>
       </w:tblPr>
       <w:tblGrid>
-        <w:gridCol w:w="4933"/>
-        <w:gridCol w:w="4933"/>
+        <w:gridCol w:w="3289"/>
+        <w:gridCol w:w="3289"/>
+        <w:gridCol w:w="3289"/>
       </w:tblGrid>
       <w:tr>
         <w:tc>
           <w:tcPr>
-            <w:tcW w:type="dxa" w:w="4933"/>
-            <w:shd w:val="clear" w:fill="1C3D5F"/>
+            <w:tcW w:type="dxa" w:w="3289"/>
           </w:tcPr>
           <w:p>
             <w:pPr>
@@ -1139,7 +1328,7 @@
               <w:rPr>
                 <w:rFonts w:ascii="Cairo" w:hAnsi="Cairo" w:cs="Cairo" w:eastAsia="Cairo"/>
                 <w:b/>
-                <w:color w:val="FFFFFF"/>
+                <w:color w:val="000000"/>
                 <w:sz w:val="24"/>
                 <w:rtl/>
               </w:rPr>
@@ -1149,8 +1338,7 @@
         </w:tc>
         <w:tc>
           <w:tcPr>
-            <w:tcW w:type="dxa" w:w="4933"/>
-            <w:shd w:val="clear" w:fill="1C3D5F"/>
+            <w:tcW w:type="dxa" w:w="3289"/>
           </w:tcPr>
           <w:p>
             <w:pPr>
@@ -1161,7 +1349,7 @@
               <w:rPr>
                 <w:rFonts w:ascii="Cairo" w:hAnsi="Cairo" w:cs="Cairo" w:eastAsia="Cairo"/>
                 <w:b/>
-                <w:color w:val="FFFFFF"/>
+                <w:color w:val="000000"/>
                 <w:sz w:val="24"/>
                 <w:rtl/>
               </w:rPr>
@@ -1169,11 +1357,32 @@
             </w:r>
           </w:p>
         </w:tc>
+        <w:tc>
+          <w:tcPr>
+            <w:tcW w:type="dxa" w:w="3289"/>
+          </w:tcPr>
+          <w:p>
+            <w:pPr>
+              <w:jc w:val="center"/>
+              <w:bidi/>
+            </w:pPr>
+            <w:r>
+              <w:rPr>
+                <w:rFonts w:ascii="Cairo" w:hAnsi="Cairo" w:cs="Cairo" w:eastAsia="Cairo"/>
+                <w:b/>
+                <w:color w:val="000000"/>
+                <w:sz w:val="24"/>
+                <w:rtl/>
+              </w:rPr>
+              <w:t>الرقم</w:t>
+            </w:r>
+          </w:p>
+        </w:tc>
       </w:tr>
       <w:tr>
         <w:tc>
           <w:tcPr>
-            <w:tcW w:type="dxa" w:w="4933"/>
+            <w:tcW w:type="dxa" w:w="3289"/>
           </w:tcPr>
           <w:p>
             <w:pPr>
@@ -1184,7 +1393,7 @@
               <w:rPr>
                 <w:rFonts w:ascii="Cairo" w:hAnsi="Cairo" w:cs="Cairo" w:eastAsia="Cairo"/>
                 <w:b w:val="0"/>
-                <w:color w:val="1C3D5F"/>
+                <w:color w:val="000000"/>
                 <w:sz w:val="23"/>
                 <w:rtl/>
               </w:rPr>
@@ -1194,7 +1403,7 @@
         </w:tc>
         <w:tc>
           <w:tcPr>
-            <w:tcW w:type="dxa" w:w="4933"/>
+            <w:tcW w:type="dxa" w:w="3289"/>
           </w:tcPr>
           <w:p>
             <w:pPr>
@@ -1205,7 +1414,7 @@
               <w:rPr>
                 <w:rFonts w:ascii="Cairo" w:hAnsi="Cairo" w:cs="Cairo" w:eastAsia="Cairo"/>
                 <w:b/>
-                <w:color w:val="1C3D5F"/>
+                <w:color w:val="000000"/>
                 <w:sz w:val="24"/>
                 <w:rtl/>
               </w:rPr>
@@ -1213,11 +1422,32 @@
             </w:r>
           </w:p>
         </w:tc>
+        <w:tc>
+          <w:tcPr>
+            <w:tcW w:type="dxa" w:w="3289"/>
+          </w:tcPr>
+          <w:p>
+            <w:pPr>
+              <w:jc w:val="center"/>
+              <w:bidi/>
+            </w:pPr>
+            <w:r>
+              <w:rPr>
+                <w:rFonts w:ascii="Cairo" w:hAnsi="Cairo" w:cs="Cairo" w:eastAsia="Cairo"/>
+                <w:b/>
+                <w:color w:val="000000"/>
+                <w:sz w:val="24"/>
+                <w:rtl/>
+              </w:rPr>
+              <w:t>١</w:t>
+            </w:r>
+          </w:p>
+        </w:tc>
       </w:tr>
       <w:tr>
         <w:tc>
           <w:tcPr>
-            <w:tcW w:type="dxa" w:w="4933"/>
+            <w:tcW w:type="dxa" w:w="3289"/>
           </w:tcPr>
           <w:p>
             <w:pPr>
@@ -1228,7 +1458,7 @@
               <w:rPr>
                 <w:rFonts w:ascii="Cairo" w:hAnsi="Cairo" w:cs="Cairo" w:eastAsia="Cairo"/>
                 <w:b w:val="0"/>
-                <w:color w:val="1C3D5F"/>
+                <w:color w:val="000000"/>
                 <w:sz w:val="23"/>
                 <w:rtl/>
               </w:rPr>
@@ -1238,7 +1468,7 @@
         </w:tc>
         <w:tc>
           <w:tcPr>
-            <w:tcW w:type="dxa" w:w="4933"/>
+            <w:tcW w:type="dxa" w:w="3289"/>
           </w:tcPr>
           <w:p>
             <w:pPr>
@@ -1249,7 +1479,7 @@
               <w:rPr>
                 <w:rFonts w:ascii="Cairo" w:hAnsi="Cairo" w:cs="Cairo" w:eastAsia="Cairo"/>
                 <w:b/>
-                <w:color w:val="1C3D5F"/>
+                <w:color w:val="000000"/>
                 <w:sz w:val="24"/>
                 <w:rtl/>
               </w:rPr>
@@ -1257,11 +1487,32 @@
             </w:r>
           </w:p>
         </w:tc>
+        <w:tc>
+          <w:tcPr>
+            <w:tcW w:type="dxa" w:w="3289"/>
+          </w:tcPr>
+          <w:p>
+            <w:pPr>
+              <w:jc w:val="center"/>
+              <w:bidi/>
+            </w:pPr>
+            <w:r>
+              <w:rPr>
+                <w:rFonts w:ascii="Cairo" w:hAnsi="Cairo" w:cs="Cairo" w:eastAsia="Cairo"/>
+                <w:b/>
+                <w:color w:val="000000"/>
+                <w:sz w:val="24"/>
+                <w:rtl/>
+              </w:rPr>
+              <w:t>٢</w:t>
+            </w:r>
+          </w:p>
+        </w:tc>
       </w:tr>
       <w:tr>
         <w:tc>
           <w:tcPr>
-            <w:tcW w:type="dxa" w:w="4933"/>
+            <w:tcW w:type="dxa" w:w="3289"/>
           </w:tcPr>
           <w:p>
             <w:pPr>
@@ -1272,7 +1523,7 @@
               <w:rPr>
                 <w:rFonts w:ascii="Cairo" w:hAnsi="Cairo" w:cs="Cairo" w:eastAsia="Cairo"/>
                 <w:b w:val="0"/>
-                <w:color w:val="1C3D5F"/>
+                <w:color w:val="000000"/>
                 <w:sz w:val="23"/>
                 <w:rtl/>
               </w:rPr>
@@ -1282,7 +1533,7 @@
         </w:tc>
         <w:tc>
           <w:tcPr>
-            <w:tcW w:type="dxa" w:w="4933"/>
+            <w:tcW w:type="dxa" w:w="3289"/>
           </w:tcPr>
           <w:p>
             <w:pPr>
@@ -1293,7 +1544,7 @@
               <w:rPr>
                 <w:rFonts w:ascii="Cairo" w:hAnsi="Cairo" w:cs="Cairo" w:eastAsia="Cairo"/>
                 <w:b/>
-                <w:color w:val="1C3D5F"/>
+                <w:color w:val="000000"/>
                 <w:sz w:val="24"/>
                 <w:rtl/>
               </w:rPr>
@@ -1301,11 +1552,32 @@
             </w:r>
           </w:p>
         </w:tc>
+        <w:tc>
+          <w:tcPr>
+            <w:tcW w:type="dxa" w:w="3289"/>
+          </w:tcPr>
+          <w:p>
+            <w:pPr>
+              <w:jc w:val="center"/>
+              <w:bidi/>
+            </w:pPr>
+            <w:r>
+              <w:rPr>
+                <w:rFonts w:ascii="Cairo" w:hAnsi="Cairo" w:cs="Cairo" w:eastAsia="Cairo"/>
+                <w:b/>
+                <w:color w:val="000000"/>
+                <w:sz w:val="24"/>
+                <w:rtl/>
+              </w:rPr>
+              <w:t>٣</w:t>
+            </w:r>
+          </w:p>
+        </w:tc>
       </w:tr>
       <w:tr>
         <w:tc>
           <w:tcPr>
-            <w:tcW w:type="dxa" w:w="4933"/>
+            <w:tcW w:type="dxa" w:w="3289"/>
           </w:tcPr>
           <w:p>
             <w:pPr>
@@ -1316,7 +1588,7 @@
               <w:rPr>
                 <w:rFonts w:ascii="Cairo" w:hAnsi="Cairo" w:cs="Cairo" w:eastAsia="Cairo"/>
                 <w:b w:val="0"/>
-                <w:color w:val="1C3D5F"/>
+                <w:color w:val="000000"/>
                 <w:sz w:val="23"/>
                 <w:rtl/>
               </w:rPr>
@@ -1326,7 +1598,7 @@
         </w:tc>
         <w:tc>
           <w:tcPr>
-            <w:tcW w:type="dxa" w:w="4933"/>
+            <w:tcW w:type="dxa" w:w="3289"/>
           </w:tcPr>
           <w:p>
             <w:pPr>
@@ -1337,7 +1609,7 @@
               <w:rPr>
                 <w:rFonts w:ascii="Cairo" w:hAnsi="Cairo" w:cs="Cairo" w:eastAsia="Cairo"/>
                 <w:b/>
-                <w:color w:val="1C3D5F"/>
+                <w:color w:val="000000"/>
                 <w:sz w:val="24"/>
                 <w:rtl/>
               </w:rPr>
@@ -1345,11 +1617,32 @@
             </w:r>
           </w:p>
         </w:tc>
+        <w:tc>
+          <w:tcPr>
+            <w:tcW w:type="dxa" w:w="3289"/>
+          </w:tcPr>
+          <w:p>
+            <w:pPr>
+              <w:jc w:val="center"/>
+              <w:bidi/>
+            </w:pPr>
+            <w:r>
+              <w:rPr>
+                <w:rFonts w:ascii="Cairo" w:hAnsi="Cairo" w:cs="Cairo" w:eastAsia="Cairo"/>
+                <w:b/>
+                <w:color w:val="000000"/>
+                <w:sz w:val="24"/>
+                <w:rtl/>
+              </w:rPr>
+              <w:t>٤</w:t>
+            </w:r>
+          </w:p>
+        </w:tc>
       </w:tr>
       <w:tr>
         <w:tc>
           <w:tcPr>
-            <w:tcW w:type="dxa" w:w="4933"/>
+            <w:tcW w:type="dxa" w:w="3289"/>
           </w:tcPr>
           <w:p>
             <w:pPr>
@@ -1360,7 +1653,7 @@
               <w:rPr>
                 <w:rFonts w:ascii="Cairo" w:hAnsi="Cairo" w:cs="Cairo" w:eastAsia="Cairo"/>
                 <w:b w:val="0"/>
-                <w:color w:val="1C3D5F"/>
+                <w:color w:val="000000"/>
                 <w:sz w:val="23"/>
                 <w:rtl/>
               </w:rPr>
@@ -1370,7 +1663,7 @@
         </w:tc>
         <w:tc>
           <w:tcPr>
-            <w:tcW w:type="dxa" w:w="4933"/>
+            <w:tcW w:type="dxa" w:w="3289"/>
           </w:tcPr>
           <w:p>
             <w:pPr>
@@ -1381,11 +1674,32 @@
               <w:rPr>
                 <w:rFonts w:ascii="Cairo" w:hAnsi="Cairo" w:cs="Cairo" w:eastAsia="Cairo"/>
                 <w:b/>
-                <w:color w:val="1C3D5F"/>
+                <w:color w:val="000000"/>
                 <w:sz w:val="24"/>
                 <w:rtl/>
               </w:rPr>
               <w:t>خرز الأرض</w:t>
+            </w:r>
+          </w:p>
+        </w:tc>
+        <w:tc>
+          <w:tcPr>
+            <w:tcW w:type="dxa" w:w="3289"/>
+          </w:tcPr>
+          <w:p>
+            <w:pPr>
+              <w:jc w:val="center"/>
+              <w:bidi/>
+            </w:pPr>
+            <w:r>
+              <w:rPr>
+                <w:rFonts w:ascii="Cairo" w:hAnsi="Cairo" w:cs="Cairo" w:eastAsia="Cairo"/>
+                <w:b/>
+                <w:color w:val="000000"/>
+                <w:sz w:val="24"/>
+                <w:rtl/>
+              </w:rPr>
+              <w:t>٥</w:t>
             </w:r>
           </w:p>
         </w:tc>
@@ -1406,7 +1720,7 @@
         <w:rPr>
           <w:rFonts w:ascii="Cairo" w:hAnsi="Cairo" w:cs="Cairo" w:eastAsia="Cairo"/>
           <w:b/>
-          <w:color w:val="1C3D5F"/>
+          <w:color w:val="000000"/>
           <w:sz w:val="40"/>
           <w:rtl/>
         </w:rPr>
@@ -1423,7 +1737,7 @@
         <w:rPr>
           <w:rFonts w:ascii="Cairo" w:hAnsi="Cairo" w:cs="Cairo" w:eastAsia="Cairo"/>
           <w:b w:val="0"/>
-          <w:color w:val="1C3D5F"/>
+          <w:color w:val="000000"/>
           <w:sz w:val="25"/>
           <w:rtl/>
         </w:rPr>
@@ -1440,11 +1754,11 @@
         <w:rPr>
           <w:rFonts w:ascii="Cairo" w:hAnsi="Cairo" w:cs="Cairo" w:eastAsia="Cairo"/>
           <w:b/>
-          <w:color w:val="C68A3E"/>
+          <w:color w:val="000000"/>
           <w:sz w:val="30"/>
           <w:rtl/>
         </w:rPr>
-        <w:t>المستوى الأول — مبتدئ (الأعداد من ١ إلى ٩)</w:t>
+        <w:t>١. المستوى الأول — مبتدئ (الأعداد من ١ إلى ٩)</w:t>
       </w:r>
     </w:p>
     <w:p>
@@ -1457,7 +1771,7 @@
         <w:rPr>
           <w:rFonts w:ascii="Cairo" w:hAnsi="Cairo" w:cs="Cairo" w:eastAsia="Cairo"/>
           <w:b w:val="0"/>
-          <w:color w:val="1C3D5F"/>
+          <w:color w:val="000000"/>
           <w:sz w:val="23"/>
           <w:rtl/>
         </w:rPr>
@@ -1474,7 +1788,7 @@
         <w:rPr>
           <w:rFonts w:ascii="Cairo" w:hAnsi="Cairo" w:cs="Cairo" w:eastAsia="Cairo"/>
           <w:b w:val="0"/>
-          <w:color w:val="1C3D5F"/>
+          <w:color w:val="000000"/>
           <w:sz w:val="22"/>
           <w:rtl/>
         </w:rPr>
@@ -1491,7 +1805,7 @@
         <w:rPr>
           <w:rFonts w:ascii="Cairo" w:hAnsi="Cairo" w:cs="Cairo" w:eastAsia="Cairo"/>
           <w:b w:val="0"/>
-          <w:color w:val="1C3D5F"/>
+          <w:color w:val="000000"/>
           <w:sz w:val="22"/>
           <w:rtl/>
         </w:rPr>
@@ -1508,7 +1822,7 @@
         <w:rPr>
           <w:rFonts w:ascii="Cairo" w:hAnsi="Cairo" w:cs="Cairo" w:eastAsia="Cairo"/>
           <w:b w:val="0"/>
-          <w:color w:val="1C3D5F"/>
+          <w:color w:val="000000"/>
           <w:sz w:val="22"/>
           <w:rtl/>
         </w:rPr>
@@ -1525,7 +1839,7 @@
         <w:rPr>
           <w:rFonts w:ascii="Cairo" w:hAnsi="Cairo" w:cs="Cairo" w:eastAsia="Cairo"/>
           <w:b w:val="0"/>
-          <w:color w:val="1C3D5F"/>
+          <w:color w:val="000000"/>
           <w:sz w:val="22"/>
           <w:rtl/>
         </w:rPr>
@@ -1542,7 +1856,7 @@
         <w:rPr>
           <w:rFonts w:ascii="Cairo" w:hAnsi="Cairo" w:cs="Cairo" w:eastAsia="Cairo"/>
           <w:b/>
-          <w:color w:val="C68A3E"/>
+          <w:color w:val="000000"/>
           <w:sz w:val="23"/>
           <w:rtl/>
         </w:rPr>
@@ -1587,7 +1901,7 @@
                           <pic:cNvPicPr/>
                         </pic:nvPicPr>
                         <pic:blipFill>
-                          <a:blip r:embed="rId15"/>
+                          <a:blip r:embed="rId17"/>
                           <a:stretch>
                             <a:fillRect/>
                           </a:stretch>
@@ -1631,7 +1945,7 @@
                           <pic:cNvPicPr/>
                         </pic:nvPicPr>
                         <pic:blipFill>
-                          <a:blip r:embed="rId16"/>
+                          <a:blip r:embed="rId18"/>
                           <a:stretch>
                             <a:fillRect/>
                           </a:stretch>
@@ -1675,7 +1989,7 @@
                           <pic:cNvPicPr/>
                         </pic:nvPicPr>
                         <pic:blipFill>
-                          <a:blip r:embed="rId17"/>
+                          <a:blip r:embed="rId19"/>
                           <a:stretch>
                             <a:fillRect/>
                           </a:stretch>
@@ -1719,7 +2033,7 @@
                           <pic:cNvPicPr/>
                         </pic:nvPicPr>
                         <pic:blipFill>
-                          <a:blip r:embed="rId18"/>
+                          <a:blip r:embed="rId20"/>
                           <a:stretch>
                             <a:fillRect/>
                           </a:stretch>
@@ -1763,7 +2077,7 @@
                           <pic:cNvPicPr/>
                         </pic:nvPicPr>
                         <pic:blipFill>
-                          <a:blip r:embed="rId19"/>
+                          <a:blip r:embed="rId21"/>
                           <a:stretch>
                             <a:fillRect/>
                           </a:stretch>
@@ -1797,7 +2111,7 @@
               <w:rPr>
                 <w:rFonts w:ascii="Cairo" w:hAnsi="Cairo" w:cs="Cairo" w:eastAsia="Cairo"/>
                 <w:b/>
-                <w:color w:val="1C3D5F"/>
+                <w:color w:val="000000"/>
                 <w:sz w:val="32"/>
               </w:rPr>
               <w:t>١</w:t>
@@ -1816,7 +2130,7 @@
               <w:rPr>
                 <w:rFonts w:ascii="Cairo" w:hAnsi="Cairo" w:cs="Cairo" w:eastAsia="Cairo"/>
                 <w:b/>
-                <w:color w:val="1C3D5F"/>
+                <w:color w:val="000000"/>
                 <w:sz w:val="32"/>
               </w:rPr>
               <w:t>٣</w:t>
@@ -1835,7 +2149,7 @@
               <w:rPr>
                 <w:rFonts w:ascii="Cairo" w:hAnsi="Cairo" w:cs="Cairo" w:eastAsia="Cairo"/>
                 <w:b/>
-                <w:color w:val="1C3D5F"/>
+                <w:color w:val="000000"/>
                 <w:sz w:val="32"/>
               </w:rPr>
               <w:t>٥</w:t>
@@ -1854,7 +2168,7 @@
               <w:rPr>
                 <w:rFonts w:ascii="Cairo" w:hAnsi="Cairo" w:cs="Cairo" w:eastAsia="Cairo"/>
                 <w:b/>
-                <w:color w:val="1C3D5F"/>
+                <w:color w:val="000000"/>
                 <w:sz w:val="32"/>
               </w:rPr>
               <w:t>٧</w:t>
@@ -1873,7 +2187,7 @@
               <w:rPr>
                 <w:rFonts w:ascii="Cairo" w:hAnsi="Cairo" w:cs="Cairo" w:eastAsia="Cairo"/>
                 <w:b/>
-                <w:color w:val="1C3D5F"/>
+                <w:color w:val="000000"/>
                 <w:sz w:val="32"/>
               </w:rPr>
               <w:t>٩</w:t>
@@ -1893,11 +2207,11 @@
         <w:rPr>
           <w:rFonts w:ascii="Cairo" w:hAnsi="Cairo" w:cs="Cairo" w:eastAsia="Cairo"/>
           <w:b/>
-          <w:color w:val="2E8B7F"/>
+          <w:color w:val="000000"/>
           <w:sz w:val="30"/>
           <w:rtl/>
         </w:rPr>
-        <w:t>المستوى الثاني — متوسط (الأعداد من ١٠ إلى ٥٠)</w:t>
+        <w:t>٢. المستوى الثاني — متوسط (الأعداد من ١٠ إلى ٥٠)</w:t>
       </w:r>
     </w:p>
     <w:p>
@@ -1910,7 +2224,7 @@
         <w:rPr>
           <w:rFonts w:ascii="Cairo" w:hAnsi="Cairo" w:cs="Cairo" w:eastAsia="Cairo"/>
           <w:b w:val="0"/>
-          <w:color w:val="1C3D5F"/>
+          <w:color w:val="000000"/>
           <w:sz w:val="23"/>
           <w:rtl/>
         </w:rPr>
@@ -1927,7 +2241,7 @@
         <w:rPr>
           <w:rFonts w:ascii="Cairo" w:hAnsi="Cairo" w:cs="Cairo" w:eastAsia="Cairo"/>
           <w:b w:val="0"/>
-          <w:color w:val="1C3D5F"/>
+          <w:color w:val="000000"/>
           <w:sz w:val="22"/>
           <w:rtl/>
         </w:rPr>
@@ -1944,7 +2258,7 @@
         <w:rPr>
           <w:rFonts w:ascii="Cairo" w:hAnsi="Cairo" w:cs="Cairo" w:eastAsia="Cairo"/>
           <w:b w:val="0"/>
-          <w:color w:val="1C3D5F"/>
+          <w:color w:val="000000"/>
           <w:sz w:val="22"/>
           <w:rtl/>
         </w:rPr>
@@ -1961,7 +2275,7 @@
         <w:rPr>
           <w:rFonts w:ascii="Cairo" w:hAnsi="Cairo" w:cs="Cairo" w:eastAsia="Cairo"/>
           <w:b w:val="0"/>
-          <w:color w:val="1C3D5F"/>
+          <w:color w:val="000000"/>
           <w:sz w:val="22"/>
           <w:rtl/>
         </w:rPr>
@@ -1978,7 +2292,7 @@
         <w:rPr>
           <w:rFonts w:ascii="Cairo" w:hAnsi="Cairo" w:cs="Cairo" w:eastAsia="Cairo"/>
           <w:b w:val="0"/>
-          <w:color w:val="1C3D5F"/>
+          <w:color w:val="000000"/>
           <w:sz w:val="22"/>
           <w:rtl/>
         </w:rPr>
@@ -1995,7 +2309,7 @@
         <w:rPr>
           <w:rFonts w:ascii="Cairo" w:hAnsi="Cairo" w:cs="Cairo" w:eastAsia="Cairo"/>
           <w:b/>
-          <w:color w:val="2E8B7F"/>
+          <w:color w:val="000000"/>
           <w:sz w:val="23"/>
           <w:rtl/>
         </w:rPr>
@@ -2039,7 +2353,7 @@
                           <pic:cNvPicPr/>
                         </pic:nvPicPr>
                         <pic:blipFill>
-                          <a:blip r:embed="rId20"/>
+                          <a:blip r:embed="rId22"/>
                           <a:stretch>
                             <a:fillRect/>
                           </a:stretch>
@@ -2083,7 +2397,7 @@
                           <pic:cNvPicPr/>
                         </pic:nvPicPr>
                         <pic:blipFill>
-                          <a:blip r:embed="rId21"/>
+                          <a:blip r:embed="rId23"/>
                           <a:stretch>
                             <a:fillRect/>
                           </a:stretch>
@@ -2127,7 +2441,7 @@
                           <pic:cNvPicPr/>
                         </pic:nvPicPr>
                         <pic:blipFill>
-                          <a:blip r:embed="rId22"/>
+                          <a:blip r:embed="rId24"/>
                           <a:stretch>
                             <a:fillRect/>
                           </a:stretch>
@@ -2171,7 +2485,7 @@
                           <pic:cNvPicPr/>
                         </pic:nvPicPr>
                         <pic:blipFill>
-                          <a:blip r:embed="rId23"/>
+                          <a:blip r:embed="rId25"/>
                           <a:stretch>
                             <a:fillRect/>
                           </a:stretch>
@@ -2205,7 +2519,7 @@
               <w:rPr>
                 <w:rFonts w:ascii="Cairo" w:hAnsi="Cairo" w:cs="Cairo" w:eastAsia="Cairo"/>
                 <w:b/>
-                <w:color w:val="1C3D5F"/>
+                <w:color w:val="000000"/>
                 <w:sz w:val="32"/>
               </w:rPr>
               <w:t>٢</w:t>
@@ -2224,7 +2538,7 @@
               <w:rPr>
                 <w:rFonts w:ascii="Cairo" w:hAnsi="Cairo" w:cs="Cairo" w:eastAsia="Cairo"/>
                 <w:b/>
-                <w:color w:val="1C3D5F"/>
+                <w:color w:val="000000"/>
                 <w:sz w:val="32"/>
               </w:rPr>
               <w:t>٤</w:t>
@@ -2243,7 +2557,7 @@
               <w:rPr>
                 <w:rFonts w:ascii="Cairo" w:hAnsi="Cairo" w:cs="Cairo" w:eastAsia="Cairo"/>
                 <w:b/>
-                <w:color w:val="1C3D5F"/>
+                <w:color w:val="000000"/>
                 <w:sz w:val="32"/>
               </w:rPr>
               <w:t>٦</w:t>
@@ -2262,7 +2576,7 @@
               <w:rPr>
                 <w:rFonts w:ascii="Cairo" w:hAnsi="Cairo" w:cs="Cairo" w:eastAsia="Cairo"/>
                 <w:b/>
-                <w:color w:val="1C3D5F"/>
+                <w:color w:val="000000"/>
                 <w:sz w:val="32"/>
               </w:rPr>
               <w:t>٨</w:t>
@@ -2282,11 +2596,11 @@
         <w:rPr>
           <w:rFonts w:ascii="Cairo" w:hAnsi="Cairo" w:cs="Cairo" w:eastAsia="Cairo"/>
           <w:b/>
-          <w:color w:val="1C3D5F"/>
+          <w:color w:val="000000"/>
           <w:sz w:val="30"/>
           <w:rtl/>
         </w:rPr>
-        <w:t>المستوى الثالث — متقدم (الأعداد من ٥٠ إلى ٩٩)</w:t>
+        <w:t>٣. المستوى الثالث — متقدم (الأعداد من ٥٠ إلى ٩٩)</w:t>
       </w:r>
     </w:p>
     <w:p>
@@ -2299,7 +2613,7 @@
         <w:rPr>
           <w:rFonts w:ascii="Cairo" w:hAnsi="Cairo" w:cs="Cairo" w:eastAsia="Cairo"/>
           <w:b w:val="0"/>
-          <w:color w:val="1C3D5F"/>
+          <w:color w:val="000000"/>
           <w:sz w:val="23"/>
           <w:rtl/>
         </w:rPr>
@@ -2316,7 +2630,7 @@
         <w:rPr>
           <w:rFonts w:ascii="Cairo" w:hAnsi="Cairo" w:cs="Cairo" w:eastAsia="Cairo"/>
           <w:b w:val="0"/>
-          <w:color w:val="1C3D5F"/>
+          <w:color w:val="000000"/>
           <w:sz w:val="22"/>
           <w:rtl/>
         </w:rPr>
@@ -2333,7 +2647,7 @@
         <w:rPr>
           <w:rFonts w:ascii="Cairo" w:hAnsi="Cairo" w:cs="Cairo" w:eastAsia="Cairo"/>
           <w:b w:val="0"/>
-          <w:color w:val="1C3D5F"/>
+          <w:color w:val="000000"/>
           <w:sz w:val="22"/>
           <w:rtl/>
         </w:rPr>
@@ -2350,7 +2664,7 @@
         <w:rPr>
           <w:rFonts w:ascii="Cairo" w:hAnsi="Cairo" w:cs="Cairo" w:eastAsia="Cairo"/>
           <w:b w:val="0"/>
-          <w:color w:val="1C3D5F"/>
+          <w:color w:val="000000"/>
           <w:sz w:val="22"/>
           <w:rtl/>
         </w:rPr>
@@ -2367,7 +2681,7 @@
         <w:rPr>
           <w:rFonts w:ascii="Cairo" w:hAnsi="Cairo" w:cs="Cairo" w:eastAsia="Cairo"/>
           <w:b w:val="0"/>
-          <w:color w:val="1C3D5F"/>
+          <w:color w:val="000000"/>
           <w:sz w:val="22"/>
           <w:rtl/>
         </w:rPr>
@@ -2384,7 +2698,7 @@
         <w:rPr>
           <w:rFonts w:ascii="Cairo" w:hAnsi="Cairo" w:cs="Cairo" w:eastAsia="Cairo"/>
           <w:b/>
-          <w:color w:val="1C3D5F"/>
+          <w:color w:val="000000"/>
           <w:sz w:val="23"/>
           <w:rtl/>
         </w:rPr>
@@ -2429,7 +2743,7 @@
                           <pic:cNvPicPr/>
                         </pic:nvPicPr>
                         <pic:blipFill>
-                          <a:blip r:embed="rId17"/>
+                          <a:blip r:embed="rId19"/>
                           <a:stretch>
                             <a:fillRect/>
                           </a:stretch>
@@ -2473,7 +2787,7 @@
                           <pic:cNvPicPr/>
                         </pic:nvPicPr>
                         <pic:blipFill>
-                          <a:blip r:embed="rId22"/>
+                          <a:blip r:embed="rId24"/>
                           <a:stretch>
                             <a:fillRect/>
                           </a:stretch>
@@ -2517,7 +2831,7 @@
                           <pic:cNvPicPr/>
                         </pic:nvPicPr>
                         <pic:blipFill>
-                          <a:blip r:embed="rId18"/>
+                          <a:blip r:embed="rId20"/>
                           <a:stretch>
                             <a:fillRect/>
                           </a:stretch>
@@ -2561,7 +2875,7 @@
                           <pic:cNvPicPr/>
                         </pic:nvPicPr>
                         <pic:blipFill>
-                          <a:blip r:embed="rId23"/>
+                          <a:blip r:embed="rId25"/>
                           <a:stretch>
                             <a:fillRect/>
                           </a:stretch>
@@ -2605,7 +2919,7 @@
                           <pic:cNvPicPr/>
                         </pic:nvPicPr>
                         <pic:blipFill>
-                          <a:blip r:embed="rId19"/>
+                          <a:blip r:embed="rId21"/>
                           <a:stretch>
                             <a:fillRect/>
                           </a:stretch>
@@ -2639,7 +2953,7 @@
               <w:rPr>
                 <w:rFonts w:ascii="Cairo" w:hAnsi="Cairo" w:cs="Cairo" w:eastAsia="Cairo"/>
                 <w:b/>
-                <w:color w:val="1C3D5F"/>
+                <w:color w:val="000000"/>
                 <w:sz w:val="32"/>
               </w:rPr>
               <w:t>٥</w:t>
@@ -2658,7 +2972,7 @@
               <w:rPr>
                 <w:rFonts w:ascii="Cairo" w:hAnsi="Cairo" w:cs="Cairo" w:eastAsia="Cairo"/>
                 <w:b/>
-                <w:color w:val="1C3D5F"/>
+                <w:color w:val="000000"/>
                 <w:sz w:val="32"/>
               </w:rPr>
               <w:t>٦</w:t>
@@ -2677,7 +2991,7 @@
               <w:rPr>
                 <w:rFonts w:ascii="Cairo" w:hAnsi="Cairo" w:cs="Cairo" w:eastAsia="Cairo"/>
                 <w:b/>
-                <w:color w:val="1C3D5F"/>
+                <w:color w:val="000000"/>
                 <w:sz w:val="32"/>
               </w:rPr>
               <w:t>٧</w:t>
@@ -2696,7 +3010,7 @@
               <w:rPr>
                 <w:rFonts w:ascii="Cairo" w:hAnsi="Cairo" w:cs="Cairo" w:eastAsia="Cairo"/>
                 <w:b/>
-                <w:color w:val="1C3D5F"/>
+                <w:color w:val="000000"/>
                 <w:sz w:val="32"/>
               </w:rPr>
               <w:t>٨</w:t>
@@ -2715,7 +3029,7 @@
               <w:rPr>
                 <w:rFonts w:ascii="Cairo" w:hAnsi="Cairo" w:cs="Cairo" w:eastAsia="Cairo"/>
                 <w:b/>
-                <w:color w:val="1C3D5F"/>
+                <w:color w:val="000000"/>
                 <w:sz w:val="32"/>
               </w:rPr>
               <w:t>٩</w:t>
@@ -2725,14 +3039,92 @@
       </w:tr>
     </w:tbl>
     <w:sectPr>
+      <w:footerReference w:type="first" r:id="rId9"/>
+      <w:footerReference w:type="default" r:id="rId10"/>
       <w:pgSz w:w="11906" w:h="16838"/>
       <w:pgMar w:top="1020" w:right="1020" w:bottom="1020" w:left="1020" w:header="720" w:footer="720" w:gutter="0"/>
+      <w:pgNumType w:start="0"/>
       <w:cols w:space="720"/>
+      <w:titlePg/>
+      <w:bidi/>
       <w:docGrid w:linePitch="360"/>
-      <w:bidi/>
     </w:sectPr>
   </w:body>
 </w:document>
+</file>
+
+<file path=word/footer1.xml><?xml version="1.0" encoding="utf-8"?>
+<w:ftr xmlns:m="http://schemas.openxmlformats.org/officeDocument/2006/math" xmlns:mc="http://schemas.openxmlformats.org/markup-compatibility/2006" xmlns:mo="http://schemas.microsoft.com/office/mac/office/2008/main" xmlns:mv="urn:schemas-microsoft-com:mac:vml" xmlns:o="urn:schemas-microsoft-com:office:office" xmlns:r="http://schemas.openxmlformats.org/officeDocument/2006/relationships" xmlns:v="urn:schemas-microsoft-com:vml" xmlns:w10="urn:schemas-microsoft-com:office:word" xmlns:w14="http://schemas.microsoft.com/office/word/2010/wordml" xmlns:w="http://schemas.openxmlformats.org/wordprocessingml/2006/main" xmlns:wne="http://schemas.microsoft.com/office/word/2006/wordml" xmlns:wp14="http://schemas.microsoft.com/office/word/2010/wordprocessingDrawing" xmlns:wp="http://schemas.openxmlformats.org/drawingml/2006/wordprocessingDrawing" xmlns:wpc="http://schemas.microsoft.com/office/word/2010/wordprocessingCanvas" xmlns:wpg="http://schemas.microsoft.com/office/word/2010/wordprocessingGroup" xmlns:wpi="http://schemas.microsoft.com/office/word/2010/wordprocessingInk" xmlns:wps="http://schemas.microsoft.com/office/word/2010/wordprocessingShape" mc:Ignorable="w14 wp14">
+  <w:p>
+    <w:pPr>
+      <w:pStyle w:val="Footer"/>
+    </w:pPr>
+  </w:p>
+</w:ftr>
+</file>
+
+<file path=word/footer2.xml><?xml version="1.0" encoding="utf-8"?>
+<w:ftr xmlns:m="http://schemas.openxmlformats.org/officeDocument/2006/math" xmlns:mc="http://schemas.openxmlformats.org/markup-compatibility/2006" xmlns:mo="http://schemas.microsoft.com/office/mac/office/2008/main" xmlns:mv="urn:schemas-microsoft-com:mac:vml" xmlns:o="urn:schemas-microsoft-com:office:office" xmlns:r="http://schemas.openxmlformats.org/officeDocument/2006/relationships" xmlns:v="urn:schemas-microsoft-com:vml" xmlns:w10="urn:schemas-microsoft-com:office:word" xmlns:w14="http://schemas.microsoft.com/office/word/2010/wordml" xmlns:w="http://schemas.openxmlformats.org/wordprocessingml/2006/main" xmlns:wne="http://schemas.microsoft.com/office/word/2006/wordml" xmlns:wp14="http://schemas.microsoft.com/office/word/2010/wordprocessingDrawing" xmlns:wp="http://schemas.openxmlformats.org/drawingml/2006/wordprocessingDrawing" xmlns:wpc="http://schemas.microsoft.com/office/word/2010/wordprocessingCanvas" xmlns:wpg="http://schemas.microsoft.com/office/word/2010/wordprocessingGroup" xmlns:wpi="http://schemas.microsoft.com/office/word/2010/wordprocessingInk" xmlns:wps="http://schemas.microsoft.com/office/word/2010/wordprocessingShape" mc:Ignorable="w14 wp14">
+  <w:p>
+    <w:pPr>
+      <w:pStyle w:val="Footer"/>
+      <w:jc w:val="center"/>
+    </w:pPr>
+    <w:r>
+      <w:rPr>
+        <w:rFonts w:ascii="Cairo-SemiBold" w:hAnsi="Cairo-SemiBold" w:cs="Cairo-SemiBold" w:eastAsia="Cairo-SemiBold"/>
+        <w:b w:val="0"/>
+        <w:color w:val="000000"/>
+        <w:sz w:val="20"/>
+      </w:rPr>
+      <w:t xml:space="preserve">-----* </w:t>
+    </w:r>
+    <w:r>
+      <w:rPr>
+        <w:rFonts w:ascii="Cairo-SemiBold" w:hAnsi="Cairo-SemiBold" w:cs="Cairo-SemiBold" w:eastAsia="Cairo-SemiBold"/>
+        <w:sz w:val="20"/>
+      </w:rPr>
+      <w:fldChar w:fldCharType="begin"/>
+    </w:r>
+    <w:r>
+      <w:rPr>
+        <w:rFonts w:ascii="Cairo-SemiBold" w:hAnsi="Cairo-SemiBold" w:cs="Cairo-SemiBold" w:eastAsia="Cairo-SemiBold"/>
+        <w:sz w:val="20"/>
+      </w:rPr>
+      <w:instrText xml:space="preserve">PAGE</w:instrText>
+    </w:r>
+    <w:r>
+      <w:rPr>
+        <w:rFonts w:ascii="Cairo-SemiBold" w:hAnsi="Cairo-SemiBold" w:cs="Cairo-SemiBold" w:eastAsia="Cairo-SemiBold"/>
+        <w:sz w:val="20"/>
+      </w:rPr>
+      <w:fldChar w:fldCharType="separate"/>
+    </w:r>
+    <w:r>
+      <w:rPr>
+        <w:rFonts w:ascii="Cairo-SemiBold" w:hAnsi="Cairo-SemiBold" w:cs="Cairo-SemiBold" w:eastAsia="Cairo-SemiBold"/>
+        <w:sz w:val="20"/>
+      </w:rPr>
+      <w:t>1</w:t>
+    </w:r>
+    <w:r>
+      <w:rPr>
+        <w:rFonts w:ascii="Cairo-SemiBold" w:hAnsi="Cairo-SemiBold" w:cs="Cairo-SemiBold" w:eastAsia="Cairo-SemiBold"/>
+        <w:sz w:val="20"/>
+      </w:rPr>
+      <w:fldChar w:fldCharType="end"/>
+    </w:r>
+    <w:r>
+      <w:rPr>
+        <w:rFonts w:ascii="Cairo-SemiBold" w:hAnsi="Cairo-SemiBold" w:cs="Cairo-SemiBold" w:eastAsia="Cairo-SemiBold"/>
+        <w:b w:val="0"/>
+        <w:color w:val="000000"/>
+        <w:sz w:val="20"/>
+      </w:rPr>
+      <w:t xml:space="preserve"> *-----</w:t>
+    </w:r>
+  </w:p>
+</w:ftr>
 </file>
 
 <file path=word/numbering.xml><?xml version="1.0" encoding="utf-8"?>

</xml_diff>